<commit_message>
Strengthen standards-derived document templates
</commit_message>
<xml_diff>
--- a/multi-templates/reference_english_business.docx
+++ b/multi-templates/reference_english_business.docx
@@ -1,13 +1,14 @@
 
 <file path=word/document.xml><?xml version="1.0" encoding="utf-8"?>
-<w:document xmlns:wpc="http://schemas.microsoft.com/office/word/2010/wordprocessingCanvas" xmlns:cx="http://schemas.microsoft.com/office/drawing/2014/chartex" xmlns:cx1="http://schemas.microsoft.com/office/drawing/2015/9/8/chartex" xmlns:cx2="http://schemas.microsoft.com/office/drawing/2015/10/21/chartex" xmlns:cx3="http://schemas.microsoft.com/office/drawing/2016/5/9/chartex" xmlns:cx4="http://schemas.microsoft.com/office/drawing/2016/5/10/chartex" xmlns:cx5="http://schemas.microsoft.com/office/drawing/2016/5/11/chartex" xmlns:cx6="http://schemas.microsoft.com/office/drawing/2016/5/12/chartex" xmlns:cx7="http://schemas.microsoft.com/office/drawing/2016/5/13/chartex" xmlns:cx8="http://schemas.microsoft.com/office/drawing/2016/5/14/chartex" xmlns:mc="http://schemas.openxmlformats.org/markup-compatibility/2006" xmlns:aink="http://schemas.microsoft.com/office/drawing/2016/ink" xmlns:am3d="http://schemas.microsoft.com/office/drawing/2017/model3d" xmlns:o="urn:schemas-microsoft-com:office:office" xmlns:oel="http://schemas.microsoft.com/office/2019/extlst" xmlns:r="http://schemas.openxmlformats.org/officeDocument/2006/relationships" xmlns:m="http://schemas.openxmlformats.org/officeDocument/2006/math" xmlns:v="urn:schemas-microsoft-com:vml" xmlns:wp14="http://schemas.microsoft.com/office/word/2010/wordprocessingDrawing" xmlns:wp="http://schemas.openxmlformats.org/drawingml/2006/wordprocessingDrawing" xmlns:w10="urn:schemas-microsoft-com:office:word" xmlns:w="http://schemas.openxmlformats.org/wordprocessingml/2006/main" xmlns:w14="http://schemas.microsoft.com/office/word/2010/wordml" xmlns:w15="http://schemas.microsoft.com/office/word/2012/wordml" xmlns:w16cex="http://schemas.microsoft.com/office/word/2018/wordml/cex" xmlns:w16cid="http://schemas.microsoft.com/office/word/2016/wordml/cid" xmlns:w16="http://schemas.microsoft.com/office/word/2018/wordml" xmlns:w16du="http://schemas.microsoft.com/office/word/2023/wordml/word16du" xmlns:w16sdtdh="http://schemas.microsoft.com/office/word/2020/wordml/sdtdatahash" xmlns:w16sdtfl="http://schemas.microsoft.com/office/word/2024/wordml/sdtformatlock" xmlns:w16se="http://schemas.microsoft.com/office/word/2015/wordml/symex" xmlns:wpg="http://schemas.microsoft.com/office/word/2010/wordprocessingGroup" xmlns:wpi="http://schemas.microsoft.com/office/word/2010/wordprocessingInk" xmlns:wne="http://schemas.microsoft.com/office/word/2006/wordml" xmlns:wps="http://schemas.microsoft.com/office/word/2010/wordprocessingShape" mc:Ignorable="w14 w15 w16se w16cid w16 w16cex w16sdtdh w16sdtfl w16du wp14">
+<w:document xmlns:w="http://schemas.openxmlformats.org/wordprocessingml/2006/main" xmlns:m="http://schemas.openxmlformats.org/officeDocument/2006/math" xmlns:r="http://schemas.openxmlformats.org/officeDocument/2006/relationships" xmlns:o="urn:schemas-microsoft-com:office:office" xmlns:v="urn:schemas-microsoft-com:vml" xmlns:w10="urn:schemas-microsoft-com:office:word" xmlns:a="http://schemas.openxmlformats.org/drawingml/2006/main" xmlns:pic="http://schemas.openxmlformats.org/drawingml/2006/picture" xmlns:wp="http://schemas.openxmlformats.org/drawingml/2006/wordprocessingDrawing">
   <w:body>
+    <w:bookmarkStart w:id="22" w:name="business-report-reference-template"/>
     <w:p>
       <w:pPr>
-        <w:pStyle w:val="a7"/>
+        <w:pStyle w:val="1"/>
       </w:pPr>
       <w:r>
-        <w:t>Business Report Template</w:t>
+        <w:t xml:space="preserve">Business Report Reference Template</w:t>
       </w:r>
     </w:p>
     <w:p>
@@ -15,15 +16,25 @@
         <w:pStyle w:val="FirstParagraph"/>
       </w:pPr>
       <w:r>
-        <w:t>This template is tuned for business plans, board summaries, investment memos, and customer-facing commercial reports. It follows the section logic used by the U.S. Small Business Administration and mainstream Microsoft business report templates.</w:t>
+        <w:t xml:space="preserve">This reference DOCX is guidance-derived, not an official Word attachment. It is designed for business plans, board summaries, investment memoranda, project business cases, and customer-facing commercial reports.</w:t>
       </w:r>
     </w:p>
     <w:p>
       <w:pPr>
+        <w:pStyle w:val="BodyText"/>
+      </w:pPr>
+      <w:r>
+        <w:t xml:space="preserve">Primary authorities considered: the U.S. Small Business Administration business plan guidance, HM Treasury Green Book and business case guidance using the Five Case Model, Microsoft Word business template conventions, and the 2023 NDRC feasibility-report outline when China-facing investment or project analysis is required.</w:t>
+      </w:r>
+    </w:p>
+    <w:bookmarkEnd w:id="22"/>
+    <w:bookmarkStart w:id="23" w:name="executive-summary"/>
+    <w:p>
+      <w:pPr>
         <w:pStyle w:val="1"/>
       </w:pPr>
       <w:r>
-        <w:t>Executive Summary</w:t>
+        <w:t xml:space="preserve">1. Executive Summary</w:t>
       </w:r>
     </w:p>
     <w:p>
@@ -31,78 +42,43 @@
         <w:pStyle w:val="FirstParagraph"/>
       </w:pPr>
       <w:r>
-        <w:t>State the opportunity, recommendation, expected business outcome, timeline, and the decision requested from sponsors or stakeholders.</w:t>
-      </w:r>
-    </w:p>
-    <w:p>
-      <w:pPr>
-        <w:pStyle w:val="1"/>
-      </w:pPr>
-      <w:r>
-        <w:t>Market and Customer Analysis</w:t>
-      </w:r>
-    </w:p>
-    <w:p>
-      <w:pPr>
-        <w:pStyle w:val="FirstParagraph"/>
-      </w:pPr>
-      <w:r>
-        <w:t>Explain customer segments, market size, adoption drivers, competitors, pricing assumptions, and the evidence that supports the business case.</w:t>
-      </w:r>
-    </w:p>
-    <w:p>
-      <w:pPr>
-        <w:pStyle w:val="1"/>
-      </w:pPr>
-      <w:r>
-        <w:t>Operating Plan and Financial View</w:t>
-      </w:r>
-    </w:p>
-    <w:p>
-      <w:pPr>
-        <w:pStyle w:val="FirstParagraph"/>
-      </w:pPr>
-      <w:r>
-        <w:t>Summarize delivery phases, ownership, resourcing, funding needs, revenue or savings assumptions, downside risks, and milestones that will be used to review performance.</w:t>
-      </w:r>
-    </w:p>
-    <w:p>
-      <w:pPr>
-        <w:pStyle w:val="TableTitle"/>
-      </w:pPr>
-      <w:r>
-        <w:t>Business Snapshot</w:t>
+        <w:t xml:space="preserve">State the opportunity, recommendation, decision requested, expected outcome, investment or resourcing need, key risks, and the time frame for review. Write this section so a sponsor can understand the proposal without reading the full report first.</w:t>
       </w:r>
     </w:p>
     <w:tbl>
       <w:tblPr>
-        <w:tblStyle w:val="ac"/>
-        <w:tblW w:w="0" w:type="auto"/>
+        <w:tblStyle w:val="Table"/>
+        <w:tblW w:type="pct" w:w="5000"/>
+        <w:tblLayout w:type="fixed"/>
+        <w:tblLook w:firstRow="1" w:lastRow="0" w:firstColumn="0" w:lastColumn="0" w:noHBand="0" w:noVBand="0" w:val="0020"/>
       </w:tblPr>
       <w:tblGrid>
-        <w:gridCol w:w="4200"/>
-        <w:gridCol w:w="4200"/>
+        <w:gridCol w:w="3960"/>
+        <w:gridCol w:w="3960"/>
       </w:tblGrid>
       <w:tr>
-        <w:tc>
-          <w:tcPr/>
-          <w:p>
-            <w:pPr>
-              <w:pStyle w:val="Compact"/>
-            </w:pPr>
-            <w:r>
-              <w:t>Section</w:t>
-            </w:r>
-          </w:p>
-        </w:tc>
-        <w:tc>
-          <w:tcPr/>
-          <w:p>
-            <w:pPr>
-              <w:pStyle w:val="Compact"/>
-            </w:pPr>
-            <w:r>
-              <w:t>Expected content</w:t>
+        <w:trPr>
+          <w:tblHeader w:val="on"/>
+        </w:trPr>
+        <w:tc>
+          <w:tcPr/>
+          <w:p>
+            <w:pPr>
+              <w:pStyle w:val="Compact"/>
+            </w:pPr>
+            <w:r>
+              <w:t xml:space="preserve">Decision Point</w:t>
+            </w:r>
+          </w:p>
+        </w:tc>
+        <w:tc>
+          <w:tcPr/>
+          <w:p>
+            <w:pPr>
+              <w:pStyle w:val="Compact"/>
+            </w:pPr>
+            <w:r>
+              <w:t xml:space="preserve">Summary</w:t>
             </w:r>
           </w:p>
         </w:tc>
@@ -115,18 +91,18 @@
               <w:pStyle w:val="Compact"/>
             </w:pPr>
             <w:r>
-              <w:t>Company / Sponsor</w:t>
-            </w:r>
-          </w:p>
-        </w:tc>
-        <w:tc>
-          <w:tcPr/>
-          <w:p>
-            <w:pPr>
-              <w:pStyle w:val="Compact"/>
-            </w:pPr>
-            <w:r>
-              <w:t>Who is accountable and what capability is being built</w:t>
+              <w:t xml:space="preserve">Proposal</w:t>
+            </w:r>
+          </w:p>
+        </w:tc>
+        <w:tc>
+          <w:tcPr/>
+          <w:p>
+            <w:pPr>
+              <w:pStyle w:val="Compact"/>
+            </w:pPr>
+            <w:r>
+              <w:t xml:space="preserve">What should be approved or changed</w:t>
             </w:r>
           </w:p>
         </w:tc>
@@ -139,18 +115,18 @@
               <w:pStyle w:val="Compact"/>
             </w:pPr>
             <w:r>
-              <w:t>Go-to-market</w:t>
-            </w:r>
-          </w:p>
-        </w:tc>
-        <w:tc>
-          <w:tcPr/>
-          <w:p>
-            <w:pPr>
-              <w:pStyle w:val="Compact"/>
-            </w:pPr>
-            <w:r>
-              <w:t>Positioning, channels, sales motion, partnerships</w:t>
+              <w:t xml:space="preserve">Strategic fit</w:t>
+            </w:r>
+          </w:p>
+        </w:tc>
+        <w:tc>
+          <w:tcPr/>
+          <w:p>
+            <w:pPr>
+              <w:pStyle w:val="Compact"/>
+            </w:pPr>
+            <w:r>
+              <w:t xml:space="preserve">Why this aligns with the organization or market</w:t>
             </w:r>
           </w:p>
         </w:tc>
@@ -163,159 +139,818 @@
               <w:pStyle w:val="Compact"/>
             </w:pPr>
             <w:r>
-              <w:t>Financials</w:t>
-            </w:r>
-          </w:p>
-        </w:tc>
-        <w:tc>
-          <w:tcPr/>
-          <w:p>
-            <w:pPr>
-              <w:pStyle w:val="Compact"/>
-            </w:pPr>
-            <w:r>
-              <w:t>Funding, forecast, break-even, ROI, scenario analysis</w:t>
+              <w:t xml:space="preserve">Value</w:t>
+            </w:r>
+          </w:p>
+        </w:tc>
+        <w:tc>
+          <w:tcPr/>
+          <w:p>
+            <w:pPr>
+              <w:pStyle w:val="Compact"/>
+            </w:pPr>
+            <w:r>
+              <w:t xml:space="preserve">Revenue, savings, service quality, resilience, or policy outcome</w:t>
+            </w:r>
+          </w:p>
+        </w:tc>
+      </w:tr>
+      <w:tr>
+        <w:tc>
+          <w:tcPr/>
+          <w:p>
+            <w:pPr>
+              <w:pStyle w:val="Compact"/>
+            </w:pPr>
+            <w:r>
+              <w:t xml:space="preserve">Funding / resources</w:t>
+            </w:r>
+          </w:p>
+        </w:tc>
+        <w:tc>
+          <w:tcPr/>
+          <w:p>
+            <w:pPr>
+              <w:pStyle w:val="Compact"/>
+            </w:pPr>
+            <w:r>
+              <w:t xml:space="preserve">Capital, operating budget, people, partners</w:t>
+            </w:r>
+          </w:p>
+        </w:tc>
+      </w:tr>
+      <w:tr>
+        <w:tc>
+          <w:tcPr/>
+          <w:p>
+            <w:pPr>
+              <w:pStyle w:val="Compact"/>
+            </w:pPr>
+            <w:r>
+              <w:t xml:space="preserve">Risk position</w:t>
+            </w:r>
+          </w:p>
+        </w:tc>
+        <w:tc>
+          <w:tcPr/>
+          <w:p>
+            <w:pPr>
+              <w:pStyle w:val="Compact"/>
+            </w:pPr>
+            <w:r>
+              <w:t xml:space="preserve">Major risks and mitigations</w:t>
             </w:r>
           </w:p>
         </w:tc>
       </w:tr>
     </w:tbl>
+    <w:bookmarkEnd w:id="23"/>
+    <w:bookmarkStart w:id="24" w:name="company-project-or-sponsor-context"/>
     <w:p>
       <w:pPr>
-        <w:pStyle w:val="FigureCaption0"/>
+        <w:pStyle w:val="1"/>
       </w:pPr>
       <w:r>
-        <w:t>Use concise section summaries and decision-oriented tables in business reports.</w:t>
+        <w:t xml:space="preserve">2. Company, Project, or Sponsor Context</w:t>
       </w:r>
     </w:p>
+    <w:p>
+      <w:pPr>
+        <w:pStyle w:val="FirstParagraph"/>
+      </w:pPr>
+      <w:r>
+        <w:t xml:space="preserve">Describe the organization, sponsor, mission, capability gap, customer problem, project background, current constraints, and the reason action is needed now.</w:t>
+      </w:r>
+    </w:p>
+    <w:bookmarkEnd w:id="24"/>
+    <w:bookmarkStart w:id="25" w:name="market-customer-and-evidence-base"/>
+    <w:p>
+      <w:pPr>
+        <w:pStyle w:val="1"/>
+      </w:pPr>
+      <w:r>
+        <w:t xml:space="preserve">3. Market, Customer, and Evidence Base</w:t>
+      </w:r>
+    </w:p>
+    <w:p>
+      <w:pPr>
+        <w:pStyle w:val="FirstParagraph"/>
+      </w:pPr>
+      <w:r>
+        <w:t xml:space="preserve">Summarize target segments, customer needs, market size, industry trends, competitor behavior, pricing assumptions, adoption drivers, and evidence quality.</w:t>
+      </w:r>
+    </w:p>
+    <w:tbl>
+      <w:tblPr>
+        <w:tblStyle w:val="Table"/>
+        <w:tblW w:type="auto" w:w="0"/>
+        <w:tblLook w:firstRow="1" w:lastRow="0" w:firstColumn="0" w:lastColumn="0" w:noHBand="0" w:noVBand="0" w:val="0020"/>
+      </w:tblPr>
+      <w:tblGrid>
+        <w:gridCol w:w="3960"/>
+        <w:gridCol w:w="3960"/>
+      </w:tblGrid>
+      <w:tr>
+        <w:trPr>
+          <w:tblHeader w:val="on"/>
+        </w:trPr>
+        <w:tc>
+          <w:tcPr/>
+          <w:p>
+            <w:pPr>
+              <w:pStyle w:val="Compact"/>
+            </w:pPr>
+            <w:r>
+              <w:t xml:space="preserve">Evidence Area</w:t>
+            </w:r>
+          </w:p>
+        </w:tc>
+        <w:tc>
+          <w:tcPr/>
+          <w:p>
+            <w:pPr>
+              <w:pStyle w:val="Compact"/>
+            </w:pPr>
+            <w:r>
+              <w:t xml:space="preserve">Questions to Answer</w:t>
+            </w:r>
+          </w:p>
+        </w:tc>
+      </w:tr>
+      <w:tr>
+        <w:tc>
+          <w:tcPr/>
+          <w:p>
+            <w:pPr>
+              <w:pStyle w:val="Compact"/>
+            </w:pPr>
+            <w:r>
+              <w:t xml:space="preserve">Customer</w:t>
+            </w:r>
+          </w:p>
+        </w:tc>
+        <w:tc>
+          <w:tcPr/>
+          <w:p>
+            <w:pPr>
+              <w:pStyle w:val="Compact"/>
+            </w:pPr>
+            <w:r>
+              <w:t xml:space="preserve">Who has the problem and how urgent is it?</w:t>
+            </w:r>
+          </w:p>
+        </w:tc>
+      </w:tr>
+      <w:tr>
+        <w:tc>
+          <w:tcPr/>
+          <w:p>
+            <w:pPr>
+              <w:pStyle w:val="Compact"/>
+            </w:pPr>
+            <w:r>
+              <w:t xml:space="preserve">Market</w:t>
+            </w:r>
+          </w:p>
+        </w:tc>
+        <w:tc>
+          <w:tcPr/>
+          <w:p>
+            <w:pPr>
+              <w:pStyle w:val="Compact"/>
+            </w:pPr>
+            <w:r>
+              <w:t xml:space="preserve">How large is the reachable opportunity?</w:t>
+            </w:r>
+          </w:p>
+        </w:tc>
+      </w:tr>
+      <w:tr>
+        <w:tc>
+          <w:tcPr/>
+          <w:p>
+            <w:pPr>
+              <w:pStyle w:val="Compact"/>
+            </w:pPr>
+            <w:r>
+              <w:t xml:space="preserve">Competition</w:t>
+            </w:r>
+          </w:p>
+        </w:tc>
+        <w:tc>
+          <w:tcPr/>
+          <w:p>
+            <w:pPr>
+              <w:pStyle w:val="Compact"/>
+            </w:pPr>
+            <w:r>
+              <w:t xml:space="preserve">What alternatives exist and why is this better?</w:t>
+            </w:r>
+          </w:p>
+        </w:tc>
+      </w:tr>
+      <w:tr>
+        <w:tc>
+          <w:tcPr/>
+          <w:p>
+            <w:pPr>
+              <w:pStyle w:val="Compact"/>
+            </w:pPr>
+            <w:r>
+              <w:t xml:space="preserve">Assumptions</w:t>
+            </w:r>
+          </w:p>
+        </w:tc>
+        <w:tc>
+          <w:tcPr/>
+          <w:p>
+            <w:pPr>
+              <w:pStyle w:val="Compact"/>
+            </w:pPr>
+            <w:r>
+              <w:t xml:space="preserve">Which assumptions require validation?</w:t>
+            </w:r>
+          </w:p>
+        </w:tc>
+      </w:tr>
+    </w:tbl>
+    <w:bookmarkEnd w:id="25"/>
+    <w:bookmarkStart w:id="26" w:name="strategic-economic-and-commercial-case"/>
+    <w:p>
+      <w:pPr>
+        <w:pStyle w:val="1"/>
+      </w:pPr>
+      <w:r>
+        <w:t xml:space="preserve">4. Strategic, Economic, and Commercial Case</w:t>
+      </w:r>
+    </w:p>
+    <w:p>
+      <w:pPr>
+        <w:pStyle w:val="FirstParagraph"/>
+      </w:pPr>
+      <w:r>
+        <w:t xml:space="preserve">For decision reports, separate the strategic fit, economic value, and commercial deliverability. Compare options, explain the preferred option, and record why rejected options were not selected.</w:t>
+      </w:r>
+    </w:p>
+    <w:tbl>
+      <w:tblPr>
+        <w:tblStyle w:val="Table"/>
+        <w:tblW w:type="pct" w:w="5000"/>
+        <w:tblLayout w:type="fixed"/>
+        <w:tblLook w:firstRow="1" w:lastRow="0" w:firstColumn="0" w:lastColumn="0" w:noHBand="0" w:noVBand="0" w:val="0020"/>
+      </w:tblPr>
+      <w:tblGrid>
+        <w:gridCol w:w="1584"/>
+        <w:gridCol w:w="1584"/>
+        <w:gridCol w:w="1584"/>
+        <w:gridCol w:w="1584"/>
+        <w:gridCol w:w="1584"/>
+      </w:tblGrid>
+      <w:tr>
+        <w:trPr>
+          <w:tblHeader w:val="on"/>
+        </w:trPr>
+        <w:tc>
+          <w:tcPr/>
+          <w:p>
+            <w:pPr>
+              <w:pStyle w:val="Compact"/>
+            </w:pPr>
+            <w:r>
+              <w:t xml:space="preserve">Option</w:t>
+            </w:r>
+          </w:p>
+        </w:tc>
+        <w:tc>
+          <w:tcPr/>
+          <w:p>
+            <w:pPr>
+              <w:pStyle w:val="Compact"/>
+            </w:pPr>
+            <w:r>
+              <w:t xml:space="preserve">Benefits</w:t>
+            </w:r>
+          </w:p>
+        </w:tc>
+        <w:tc>
+          <w:tcPr/>
+          <w:p>
+            <w:pPr>
+              <w:pStyle w:val="Compact"/>
+            </w:pPr>
+            <w:r>
+              <w:t xml:space="preserve">Costs</w:t>
+            </w:r>
+          </w:p>
+        </w:tc>
+        <w:tc>
+          <w:tcPr/>
+          <w:p>
+            <w:pPr>
+              <w:pStyle w:val="Compact"/>
+            </w:pPr>
+            <w:r>
+              <w:t xml:space="preserve">Risks</w:t>
+            </w:r>
+          </w:p>
+        </w:tc>
+        <w:tc>
+          <w:tcPr/>
+          <w:p>
+            <w:pPr>
+              <w:pStyle w:val="Compact"/>
+            </w:pPr>
+            <w:r>
+              <w:t xml:space="preserve">Decision</w:t>
+            </w:r>
+          </w:p>
+        </w:tc>
+      </w:tr>
+      <w:tr>
+        <w:tc>
+          <w:tcPr/>
+          <w:p>
+            <w:pPr>
+              <w:pStyle w:val="Compact"/>
+            </w:pPr>
+            <w:r>
+              <w:t xml:space="preserve">Do nothing</w:t>
+            </w:r>
+          </w:p>
+        </w:tc>
+        <w:tc>
+          <w:tcPr/>
+          <w:p>
+            <w:pPr>
+              <w:pStyle w:val="Compact"/>
+            </w:pPr>
+            <w:r>
+              <w:t xml:space="preserve">Baseline only</w:t>
+            </w:r>
+          </w:p>
+        </w:tc>
+        <w:tc>
+          <w:tcPr/>
+          <w:p>
+            <w:pPr>
+              <w:pStyle w:val="Compact"/>
+            </w:pPr>
+            <w:r>
+              <w:t xml:space="preserve">No new spend</w:t>
+            </w:r>
+          </w:p>
+        </w:tc>
+        <w:tc>
+          <w:tcPr/>
+          <w:p>
+            <w:pPr>
+              <w:pStyle w:val="Compact"/>
+            </w:pPr>
+            <w:r>
+              <w:t xml:space="preserve">Opportunity loss</w:t>
+            </w:r>
+          </w:p>
+        </w:tc>
+        <w:tc>
+          <w:tcPr/>
+          <w:p>
+            <w:pPr>
+              <w:pStyle w:val="Compact"/>
+            </w:pPr>
+            <w:r>
+              <w:t xml:space="preserve">Rejected</w:t>
+            </w:r>
+          </w:p>
+        </w:tc>
+      </w:tr>
+      <w:tr>
+        <w:tc>
+          <w:tcPr/>
+          <w:p>
+            <w:pPr>
+              <w:pStyle w:val="Compact"/>
+            </w:pPr>
+            <w:r>
+              <w:t xml:space="preserve">Minimum viable option</w:t>
+            </w:r>
+          </w:p>
+        </w:tc>
+        <w:tc>
+          <w:tcPr/>
+          <w:p>
+            <w:pPr>
+              <w:pStyle w:val="Compact"/>
+            </w:pPr>
+            <w:r>
+              <w:t xml:space="preserve">Faster learning</w:t>
+            </w:r>
+          </w:p>
+        </w:tc>
+        <w:tc>
+          <w:tcPr/>
+          <w:p>
+            <w:pPr>
+              <w:pStyle w:val="Compact"/>
+            </w:pPr>
+            <w:r>
+              <w:t xml:space="preserve">Limited scope</w:t>
+            </w:r>
+          </w:p>
+        </w:tc>
+        <w:tc>
+          <w:tcPr/>
+          <w:p>
+            <w:pPr>
+              <w:pStyle w:val="Compact"/>
+            </w:pPr>
+            <w:r>
+              <w:t xml:space="preserve">Partial benefit</w:t>
+            </w:r>
+          </w:p>
+        </w:tc>
+        <w:tc>
+          <w:tcPr/>
+          <w:p>
+            <w:pPr>
+              <w:pStyle w:val="Compact"/>
+            </w:pPr>
+            <w:r>
+              <w:t xml:space="preserve">Consider</w:t>
+            </w:r>
+          </w:p>
+        </w:tc>
+      </w:tr>
+      <w:tr>
+        <w:tc>
+          <w:tcPr/>
+          <w:p>
+            <w:pPr>
+              <w:pStyle w:val="Compact"/>
+            </w:pPr>
+            <w:r>
+              <w:t xml:space="preserve">Recommended option</w:t>
+            </w:r>
+          </w:p>
+        </w:tc>
+        <w:tc>
+          <w:tcPr/>
+          <w:p>
+            <w:pPr>
+              <w:pStyle w:val="Compact"/>
+            </w:pPr>
+            <w:r>
+              <w:t xml:space="preserve">Best fit to objectives</w:t>
+            </w:r>
+          </w:p>
+        </w:tc>
+        <w:tc>
+          <w:tcPr/>
+          <w:p>
+            <w:pPr>
+              <w:pStyle w:val="Compact"/>
+            </w:pPr>
+            <w:r>
+              <w:t xml:space="preserve">Managed investment</w:t>
+            </w:r>
+          </w:p>
+        </w:tc>
+        <w:tc>
+          <w:tcPr/>
+          <w:p>
+            <w:pPr>
+              <w:pStyle w:val="Compact"/>
+            </w:pPr>
+            <w:r>
+              <w:t xml:space="preserve">Execution risk</w:t>
+            </w:r>
+          </w:p>
+        </w:tc>
+        <w:tc>
+          <w:tcPr/>
+          <w:p>
+            <w:pPr>
+              <w:pStyle w:val="Compact"/>
+            </w:pPr>
+            <w:r>
+              <w:t xml:space="preserve">Preferred</w:t>
+            </w:r>
+          </w:p>
+        </w:tc>
+      </w:tr>
+    </w:tbl>
+    <w:bookmarkEnd w:id="26"/>
+    <w:bookmarkStart w:id="27" w:name="operating-plan-and-delivery-model"/>
+    <w:p>
+      <w:pPr>
+        <w:pStyle w:val="1"/>
+      </w:pPr>
+      <w:r>
+        <w:t xml:space="preserve">5. Operating Plan and Delivery Model</w:t>
+      </w:r>
+    </w:p>
+    <w:p>
+      <w:pPr>
+        <w:pStyle w:val="FirstParagraph"/>
+      </w:pPr>
+      <w:r>
+        <w:t xml:space="preserve">Explain implementation phases, accountable owners, team model, partners or suppliers, governance, timeline, dependencies, and measurable milestones.</w:t>
+      </w:r>
+    </w:p>
+    <w:bookmarkEnd w:id="27"/>
+    <w:bookmarkStart w:id="28" w:name="financial-view"/>
+    <w:p>
+      <w:pPr>
+        <w:pStyle w:val="1"/>
+      </w:pPr>
+      <w:r>
+        <w:t xml:space="preserve">6. Financial View</w:t>
+      </w:r>
+    </w:p>
+    <w:p>
+      <w:pPr>
+        <w:pStyle w:val="FirstParagraph"/>
+      </w:pPr>
+      <w:r>
+        <w:t xml:space="preserve">Present funding needs, revenue or savings assumptions, cash flow, break-even logic, return-on-investment view, sensitivity analysis, and the connection between financial projections and the market or operating assumptions above.</w:t>
+      </w:r>
+    </w:p>
+    <w:tbl>
+      <w:tblPr>
+        <w:tblStyle w:val="Table"/>
+        <w:tblW w:type="auto" w:w="0"/>
+        <w:tblLook w:firstRow="1" w:lastRow="0" w:firstColumn="0" w:lastColumn="0" w:noHBand="0" w:noVBand="0" w:val="0020"/>
+      </w:tblPr>
+      <w:tblGrid>
+        <w:gridCol w:w="1980"/>
+        <w:gridCol w:w="1980"/>
+        <w:gridCol w:w="1980"/>
+        <w:gridCol w:w="1980"/>
+      </w:tblGrid>
+      <w:tr>
+        <w:trPr>
+          <w:tblHeader w:val="on"/>
+        </w:trPr>
+        <w:tc>
+          <w:tcPr/>
+          <w:p>
+            <w:pPr>
+              <w:pStyle w:val="Compact"/>
+            </w:pPr>
+            <w:r>
+              <w:t xml:space="preserve">Metric</w:t>
+            </w:r>
+          </w:p>
+        </w:tc>
+        <w:tc>
+          <w:tcPr/>
+          <w:p>
+            <w:pPr>
+              <w:pStyle w:val="Compact"/>
+              <w:jc w:val="right"/>
+            </w:pPr>
+            <w:r>
+              <w:t xml:space="preserve">Year 1</w:t>
+            </w:r>
+          </w:p>
+        </w:tc>
+        <w:tc>
+          <w:tcPr/>
+          <w:p>
+            <w:pPr>
+              <w:pStyle w:val="Compact"/>
+              <w:jc w:val="right"/>
+            </w:pPr>
+            <w:r>
+              <w:t xml:space="preserve">Year 2</w:t>
+            </w:r>
+          </w:p>
+        </w:tc>
+        <w:tc>
+          <w:tcPr/>
+          <w:p>
+            <w:pPr>
+              <w:pStyle w:val="Compact"/>
+              <w:jc w:val="right"/>
+            </w:pPr>
+            <w:r>
+              <w:t xml:space="preserve">Year 3</w:t>
+            </w:r>
+          </w:p>
+        </w:tc>
+      </w:tr>
+      <w:tr>
+        <w:tc>
+          <w:tcPr/>
+          <w:p>
+            <w:pPr>
+              <w:pStyle w:val="Compact"/>
+            </w:pPr>
+            <w:r>
+              <w:t xml:space="preserve">Revenue or savings</w:t>
+            </w:r>
+          </w:p>
+        </w:tc>
+        <w:tc>
+          <w:tcPr/>
+          <w:p>
+            <w:pPr>
+              <w:pStyle w:val="Compact"/>
+            </w:pPr>
+          </w:p>
+        </w:tc>
+        <w:tc>
+          <w:tcPr/>
+          <w:p>
+            <w:pPr>
+              <w:pStyle w:val="Compact"/>
+            </w:pPr>
+          </w:p>
+        </w:tc>
+        <w:tc>
+          <w:tcPr/>
+          <w:p>
+            <w:pPr>
+              <w:pStyle w:val="Compact"/>
+            </w:pPr>
+          </w:p>
+        </w:tc>
+      </w:tr>
+      <w:tr>
+        <w:tc>
+          <w:tcPr/>
+          <w:p>
+            <w:pPr>
+              <w:pStyle w:val="Compact"/>
+            </w:pPr>
+            <w:r>
+              <w:t xml:space="preserve">Operating cost</w:t>
+            </w:r>
+          </w:p>
+        </w:tc>
+        <w:tc>
+          <w:tcPr/>
+          <w:p>
+            <w:pPr>
+              <w:pStyle w:val="Compact"/>
+            </w:pPr>
+          </w:p>
+        </w:tc>
+        <w:tc>
+          <w:tcPr/>
+          <w:p>
+            <w:pPr>
+              <w:pStyle w:val="Compact"/>
+            </w:pPr>
+          </w:p>
+        </w:tc>
+        <w:tc>
+          <w:tcPr/>
+          <w:p>
+            <w:pPr>
+              <w:pStyle w:val="Compact"/>
+            </w:pPr>
+          </w:p>
+        </w:tc>
+      </w:tr>
+      <w:tr>
+        <w:tc>
+          <w:tcPr/>
+          <w:p>
+            <w:pPr>
+              <w:pStyle w:val="Compact"/>
+            </w:pPr>
+            <w:r>
+              <w:t xml:space="preserve">Capital spend</w:t>
+            </w:r>
+          </w:p>
+        </w:tc>
+        <w:tc>
+          <w:tcPr/>
+          <w:p>
+            <w:pPr>
+              <w:pStyle w:val="Compact"/>
+            </w:pPr>
+          </w:p>
+        </w:tc>
+        <w:tc>
+          <w:tcPr/>
+          <w:p>
+            <w:pPr>
+              <w:pStyle w:val="Compact"/>
+            </w:pPr>
+          </w:p>
+        </w:tc>
+        <w:tc>
+          <w:tcPr/>
+          <w:p>
+            <w:pPr>
+              <w:pStyle w:val="Compact"/>
+            </w:pPr>
+          </w:p>
+        </w:tc>
+      </w:tr>
+      <w:tr>
+        <w:tc>
+          <w:tcPr/>
+          <w:p>
+            <w:pPr>
+              <w:pStyle w:val="Compact"/>
+            </w:pPr>
+            <w:r>
+              <w:t xml:space="preserve">Net impact</w:t>
+            </w:r>
+          </w:p>
+        </w:tc>
+        <w:tc>
+          <w:tcPr/>
+          <w:p>
+            <w:pPr>
+              <w:pStyle w:val="Compact"/>
+            </w:pPr>
+          </w:p>
+        </w:tc>
+        <w:tc>
+          <w:tcPr/>
+          <w:p>
+            <w:pPr>
+              <w:pStyle w:val="Compact"/>
+            </w:pPr>
+          </w:p>
+        </w:tc>
+        <w:tc>
+          <w:tcPr/>
+          <w:p>
+            <w:pPr>
+              <w:pStyle w:val="Compact"/>
+            </w:pPr>
+          </w:p>
+        </w:tc>
+      </w:tr>
+    </w:tbl>
+    <w:bookmarkEnd w:id="28"/>
+    <w:bookmarkStart w:id="29" w:name="risk-governance-and-management-case"/>
+    <w:p>
+      <w:pPr>
+        <w:pStyle w:val="1"/>
+      </w:pPr>
+      <w:r>
+        <w:t xml:space="preserve">7. Risk, Governance, and Management Case</w:t>
+      </w:r>
+    </w:p>
+    <w:p>
+      <w:pPr>
+        <w:pStyle w:val="FirstParagraph"/>
+      </w:pPr>
+      <w:r>
+        <w:t xml:space="preserve">List major commercial, operational, legal, data, financial, and delivery risks. Record mitigations, owners, review cadence, and escalation path.</w:t>
+      </w:r>
+    </w:p>
+    <w:bookmarkEnd w:id="29"/>
+    <w:bookmarkStart w:id="30" w:name="conclusion-and-next-actions"/>
+    <w:p>
+      <w:pPr>
+        <w:pStyle w:val="1"/>
+      </w:pPr>
+      <w:r>
+        <w:t xml:space="preserve">8. Conclusion and Next Actions</w:t>
+      </w:r>
+    </w:p>
+    <w:p>
+      <w:pPr>
+        <w:pStyle w:val="FirstParagraph"/>
+      </w:pPr>
+      <w:r>
+        <w:t xml:space="preserve">Close with the recommended decision, immediate next steps, required approvals, and the date or milestone for reassessment.</w:t>
+      </w:r>
+    </w:p>
+    <w:bookmarkEnd w:id="30"/>
     <w:sectPr>
-      <w:headerReference w:type="default" r:id="rId13"/>
-      <w:pgSz w:w="11907" w:h="16839"/>
-      <w:pgMar w:top="1584" w:right="1440" w:bottom="1584" w:left="1440" w:header="431" w:footer="431" w:gutter="0"/>
+      <w:headerReference r:id="rId13" w:type="default"/>
+      <w:pgSz w:h="16839" w:w="11907"/>
+      <w:pgMar w:bottom="1584" w:footer="431" w:gutter="0" w:header="431" w:left="1440" w:right="1440" w:top="1584"/>
       <w:cols w:num="2" w:space="288"/>
     </w:sectPr>
   </w:body>
 </w:document>
 </file>
 
-<file path=word/endnotes.xml><?xml version="1.0" encoding="utf-8"?>
-<w:endnotes xmlns:wpc="http://schemas.microsoft.com/office/word/2010/wordprocessingCanvas" xmlns:cx="http://schemas.microsoft.com/office/drawing/2014/chartex" xmlns:cx1="http://schemas.microsoft.com/office/drawing/2015/9/8/chartex" xmlns:cx2="http://schemas.microsoft.com/office/drawing/2015/10/21/chartex" xmlns:cx3="http://schemas.microsoft.com/office/drawing/2016/5/9/chartex" xmlns:cx4="http://schemas.microsoft.com/office/drawing/2016/5/10/chartex" xmlns:cx5="http://schemas.microsoft.com/office/drawing/2016/5/11/chartex" xmlns:cx6="http://schemas.microsoft.com/office/drawing/2016/5/12/chartex" xmlns:cx7="http://schemas.microsoft.com/office/drawing/2016/5/13/chartex" xmlns:cx8="http://schemas.microsoft.com/office/drawing/2016/5/14/chartex" xmlns:mc="http://schemas.openxmlformats.org/markup-compatibility/2006" xmlns:aink="http://schemas.microsoft.com/office/drawing/2016/ink" xmlns:am3d="http://schemas.microsoft.com/office/drawing/2017/model3d" xmlns:o="urn:schemas-microsoft-com:office:office" xmlns:oel="http://schemas.microsoft.com/office/2019/extlst" xmlns:r="http://schemas.openxmlformats.org/officeDocument/2006/relationships" xmlns:m="http://schemas.openxmlformats.org/officeDocument/2006/math" xmlns:v="urn:schemas-microsoft-com:vml" xmlns:wp14="http://schemas.microsoft.com/office/word/2010/wordprocessingDrawing" xmlns:wp="http://schemas.openxmlformats.org/drawingml/2006/wordprocessingDrawing" xmlns:w10="urn:schemas-microsoft-com:office:word" xmlns:w="http://schemas.openxmlformats.org/wordprocessingml/2006/main" xmlns:w14="http://schemas.microsoft.com/office/word/2010/wordml" xmlns:w15="http://schemas.microsoft.com/office/word/2012/wordml" xmlns:w16cex="http://schemas.microsoft.com/office/word/2018/wordml/cex" xmlns:w16cid="http://schemas.microsoft.com/office/word/2016/wordml/cid" xmlns:w16="http://schemas.microsoft.com/office/word/2018/wordml" xmlns:w16du="http://schemas.microsoft.com/office/word/2023/wordml/word16du" xmlns:w16sdtdh="http://schemas.microsoft.com/office/word/2020/wordml/sdtdatahash" xmlns:w16sdtfl="http://schemas.microsoft.com/office/word/2024/wordml/sdtformatlock" xmlns:w16se="http://schemas.microsoft.com/office/word/2015/wordml/symex" xmlns:wpg="http://schemas.microsoft.com/office/word/2010/wordprocessingGroup" xmlns:wpi="http://schemas.microsoft.com/office/word/2010/wordprocessingInk" xmlns:wne="http://schemas.microsoft.com/office/word/2006/wordml" xmlns:wps="http://schemas.microsoft.com/office/word/2010/wordprocessingShape" mc:Ignorable="w14 w15 w16se w16cid w16 w16cex w16sdtdh w16sdtfl w16du wp14">
-  <w:endnote w:type="separator" w:id="-1">
-    <w:p>
-      <w:pPr>
-        <w:rPr>
-          <w:sz w:val="18"/>
-        </w:rPr>
-      </w:pPr>
-    </w:p>
-  </w:endnote>
-  <w:endnote w:type="continuationSeparator" w:id="0">
-    <w:p>
-      <w:pPr>
-        <w:rPr>
-          <w:sz w:val="18"/>
-        </w:rPr>
-      </w:pPr>
-    </w:p>
-  </w:endnote>
-</w:endnotes>
+<file path=word/comments.xml><?xml version="1.0" encoding="utf-8"?>
+<w:comments xmlns:w="http://schemas.openxmlformats.org/wordprocessingml/2006/main" xmlns:m="http://schemas.openxmlformats.org/officeDocument/2006/math" xmlns:r="http://schemas.openxmlformats.org/officeDocument/2006/relationships" xmlns:o="urn:schemas-microsoft-com:office:office" xmlns:v="urn:schemas-microsoft-com:vml" xmlns:w10="urn:schemas-microsoft-com:office:word" xmlns:a="http://schemas.openxmlformats.org/drawingml/2006/main" xmlns:pic="http://schemas.openxmlformats.org/drawingml/2006/picture" xmlns:wp="http://schemas.openxmlformats.org/drawingml/2006/wordprocessingDrawing"/>
 </file>
 
 <file path=word/footnotes.xml><?xml version="1.0" encoding="utf-8"?>
-<w:footnotes xmlns:wpc="http://schemas.microsoft.com/office/word/2010/wordprocessingCanvas" xmlns:cx="http://schemas.microsoft.com/office/drawing/2014/chartex" xmlns:cx1="http://schemas.microsoft.com/office/drawing/2015/9/8/chartex" xmlns:cx2="http://schemas.microsoft.com/office/drawing/2015/10/21/chartex" xmlns:cx3="http://schemas.microsoft.com/office/drawing/2016/5/9/chartex" xmlns:cx4="http://schemas.microsoft.com/office/drawing/2016/5/10/chartex" xmlns:cx5="http://schemas.microsoft.com/office/drawing/2016/5/11/chartex" xmlns:cx6="http://schemas.microsoft.com/office/drawing/2016/5/12/chartex" xmlns:cx7="http://schemas.microsoft.com/office/drawing/2016/5/13/chartex" xmlns:cx8="http://schemas.microsoft.com/office/drawing/2016/5/14/chartex" xmlns:mc="http://schemas.openxmlformats.org/markup-compatibility/2006" xmlns:aink="http://schemas.microsoft.com/office/drawing/2016/ink" xmlns:am3d="http://schemas.microsoft.com/office/drawing/2017/model3d" xmlns:o="urn:schemas-microsoft-com:office:office" xmlns:oel="http://schemas.microsoft.com/office/2019/extlst" xmlns:r="http://schemas.openxmlformats.org/officeDocument/2006/relationships" xmlns:m="http://schemas.openxmlformats.org/officeDocument/2006/math" xmlns:v="urn:schemas-microsoft-com:vml" xmlns:wp14="http://schemas.microsoft.com/office/word/2010/wordprocessingDrawing" xmlns:wp="http://schemas.openxmlformats.org/drawingml/2006/wordprocessingDrawing" xmlns:w10="urn:schemas-microsoft-com:office:word" xmlns:w="http://schemas.openxmlformats.org/wordprocessingml/2006/main" xmlns:w14="http://schemas.microsoft.com/office/word/2010/wordml" xmlns:w15="http://schemas.microsoft.com/office/word/2012/wordml" xmlns:w16cex="http://schemas.microsoft.com/office/word/2018/wordml/cex" xmlns:w16cid="http://schemas.microsoft.com/office/word/2016/wordml/cid" xmlns:w16="http://schemas.microsoft.com/office/word/2018/wordml" xmlns:w16du="http://schemas.microsoft.com/office/word/2023/wordml/word16du" xmlns:w16sdtdh="http://schemas.microsoft.com/office/word/2020/wordml/sdtdatahash" xmlns:w16sdtfl="http://schemas.microsoft.com/office/word/2024/wordml/sdtformatlock" xmlns:w16se="http://schemas.microsoft.com/office/word/2015/wordml/symex" xmlns:wpg="http://schemas.microsoft.com/office/word/2010/wordprocessingGroup" xmlns:wpi="http://schemas.microsoft.com/office/word/2010/wordprocessingInk" xmlns:wne="http://schemas.microsoft.com/office/word/2006/wordml" xmlns:wps="http://schemas.microsoft.com/office/word/2010/wordprocessingShape" mc:Ignorable="w14 w15 w16se w16cid w16 w16cex w16sdtdh w16sdtfl w16du wp14">
-  <w:footnote w:type="separator" w:id="-1">
-    <w:p>
-      <w:pPr>
-        <w:rPr>
-          <w:sz w:val="18"/>
-        </w:rPr>
-      </w:pPr>
-    </w:p>
-  </w:footnote>
+<w:footnotes xmlns:w="http://schemas.openxmlformats.org/wordprocessingml/2006/main" xmlns:m="http://schemas.openxmlformats.org/officeDocument/2006/math" xmlns:r="http://schemas.openxmlformats.org/officeDocument/2006/relationships" xmlns:o="urn:schemas-microsoft-com:office:office" xmlns:v="urn:schemas-microsoft-com:vml" xmlns:w10="urn:schemas-microsoft-com:office:word" xmlns:a="http://schemas.openxmlformats.org/drawingml/2006/main" xmlns:pic="http://schemas.openxmlformats.org/drawingml/2006/picture" xmlns:wp="http://schemas.openxmlformats.org/drawingml/2006/wordprocessingDrawing">
   <w:footnote w:type="continuationSeparator" w:id="0">
     <w:p>
-      <w:pPr>
-        <w:rPr>
-          <w:sz w:val="18"/>
-        </w:rPr>
-      </w:pPr>
-    </w:p>
-  </w:footnote>
-  <w:footnote w:id="1">
-    <w:p>
-      <w:pPr>
-        <w:pStyle w:val="a8"/>
-      </w:pPr>
       <w:r>
-        <w:t>Manuscript received October 9, 2001</w:t>
-      </w:r>
-      <w:r>
-        <w:rPr>
-          <w:rFonts w:eastAsia="宋体" w:hint="eastAsia"/>
-          <w:lang w:eastAsia="zh-CN"/>
-        </w:rPr>
-        <w:t xml:space="preserve">. </w:t>
-      </w:r>
-      <w:r>
-        <w:t>(Write the date on which you submitted your paper for review.) This work was supported in part by the U.S. Depart</w:t>
-      </w:r>
-      <w:r>
-        <w:softHyphen/>
-        <w:t>ment of Com</w:t>
-      </w:r>
-      <w:r>
-        <w:softHyphen/>
-        <w:t xml:space="preserve">merce under Grant BS123456 (sponsor and financial support acknowledgment goes here). Paper titles should be written in uppercase and lowercase letters, not all uppercase. Avoid writing long formulas with subscripts in the title; short formulas that identify the elements are fine (e.g., "Nd–Fe–B"). Do not write "(Invited)" in the title. Full names of authors are preferred in the author field, but are not required. Put a space between authors' initials. </w:t>
-      </w:r>
-    </w:p>
-    <w:p>
-      <w:pPr>
-        <w:pStyle w:val="a8"/>
-      </w:pPr>
-      <w:r>
-        <w:t xml:space="preserve">F. A. Author is with the National Institute of Standards and Technology, Boulder, CO 80305 USA (e-mail: author@ boulder.nist.gov). </w:t>
-      </w:r>
-    </w:p>
-    <w:p>
-      <w:pPr>
-        <w:pStyle w:val="a8"/>
-      </w:pPr>
-      <w:r>
-        <w:t>S. B. Author</w:t>
-      </w:r>
-      <w:r>
-        <w:rPr>
-          <w:rFonts w:eastAsia="宋体" w:hint="eastAsia"/>
-          <w:lang w:eastAsia="zh-CN"/>
-        </w:rPr>
-        <w:t xml:space="preserve"> </w:t>
-      </w:r>
-      <w:r>
-        <w:t>was with Rice University, Houston, TX 77005 USA. He is now with the Department of Physics, Colorado State University, Fort Collins, CO 80523 USA (e-mail: author@lamar. colostate.edu).</w:t>
-      </w:r>
-    </w:p>
-    <w:p>
-      <w:pPr>
-        <w:pStyle w:val="a8"/>
-      </w:pPr>
-      <w:r>
-        <w:t>T. C. Author is with the Electrical Engineering Department, University of Colorado, Boulder, CO 80309 USA, on leave from the National Research Institute for Metals, Tsukuba, Japan (e-mail: author@nrim.go.jp).</w:t>
+        <w:continuationSeparator/>
       </w:r>
     </w:p>
   </w:footnote>
-  <w:footnote w:id="2">
+  <w:footnote w:type="separator" w:id="-1">
     <w:p>
-      <w:pPr>
-        <w:pStyle w:val="a8"/>
-      </w:pPr>
       <w:r>
-        <w:rPr>
-          <w:rStyle w:val="a3"/>
-        </w:rPr>
-        <w:footnoteRef/>
-      </w:r>
-      <w:r>
-        <w:t>It is recommended that footnotes be avoided (except for the unnumbered footnote with the receipt date on the first page). Instead, try to integrate the footnote information into the text.</w:t>
+        <w:separator/>
       </w:r>
     </w:p>
   </w:footnote>
@@ -341,8 +976,8 @@
 </file>
 
 <file path=word/numbering.xml><?xml version="1.0" encoding="utf-8"?>
-<w:numbering xmlns:wpc="http://schemas.microsoft.com/office/word/2010/wordprocessingCanvas" xmlns:cx="http://schemas.microsoft.com/office/drawing/2014/chartex" xmlns:cx1="http://schemas.microsoft.com/office/drawing/2015/9/8/chartex" xmlns:cx2="http://schemas.microsoft.com/office/drawing/2015/10/21/chartex" xmlns:cx3="http://schemas.microsoft.com/office/drawing/2016/5/9/chartex" xmlns:cx4="http://schemas.microsoft.com/office/drawing/2016/5/10/chartex" xmlns:cx5="http://schemas.microsoft.com/office/drawing/2016/5/11/chartex" xmlns:cx6="http://schemas.microsoft.com/office/drawing/2016/5/12/chartex" xmlns:cx7="http://schemas.microsoft.com/office/drawing/2016/5/13/chartex" xmlns:cx8="http://schemas.microsoft.com/office/drawing/2016/5/14/chartex" xmlns:mc="http://schemas.openxmlformats.org/markup-compatibility/2006" xmlns:aink="http://schemas.microsoft.com/office/drawing/2016/ink" xmlns:am3d="http://schemas.microsoft.com/office/drawing/2017/model3d" xmlns:o="urn:schemas-microsoft-com:office:office" xmlns:oel="http://schemas.microsoft.com/office/2019/extlst" xmlns:r="http://schemas.openxmlformats.org/officeDocument/2006/relationships" xmlns:m="http://schemas.openxmlformats.org/officeDocument/2006/math" xmlns:v="urn:schemas-microsoft-com:vml" xmlns:wp14="http://schemas.microsoft.com/office/word/2010/wordprocessingDrawing" xmlns:wp="http://schemas.openxmlformats.org/drawingml/2006/wordprocessingDrawing" xmlns:w10="urn:schemas-microsoft-com:office:word" xmlns:w="http://schemas.openxmlformats.org/wordprocessingml/2006/main" xmlns:w14="http://schemas.microsoft.com/office/word/2010/wordml" xmlns:w15="http://schemas.microsoft.com/office/word/2012/wordml" xmlns:w16cex="http://schemas.microsoft.com/office/word/2018/wordml/cex" xmlns:w16cid="http://schemas.microsoft.com/office/word/2016/wordml/cid" xmlns:w16="http://schemas.microsoft.com/office/word/2018/wordml" xmlns:w16du="http://schemas.microsoft.com/office/word/2023/wordml/word16du" xmlns:w16sdtdh="http://schemas.microsoft.com/office/word/2020/wordml/sdtdatahash" xmlns:w16sdtfl="http://schemas.microsoft.com/office/word/2024/wordml/sdtformatlock" xmlns:w16se="http://schemas.microsoft.com/office/word/2015/wordml/symex" xmlns:wpg="http://schemas.microsoft.com/office/word/2010/wordprocessingGroup" xmlns:wpi="http://schemas.microsoft.com/office/word/2010/wordprocessingInk" xmlns:wne="http://schemas.microsoft.com/office/word/2006/wordml" xmlns:wps="http://schemas.microsoft.com/office/word/2010/wordprocessingShape" mc:Ignorable="w14 w15 w16se w16cid w16 w16cex w16sdtdh w16sdtfl w16du wp14">
-  <w:abstractNum w:abstractNumId="0" w15:restartNumberingAfterBreak="0">
+<w:numbering xmlns:aink="http://schemas.microsoft.com/office/drawing/2016/ink" xmlns:am3d="http://schemas.microsoft.com/office/drawing/2017/model3d" xmlns:cx="http://schemas.microsoft.com/office/drawing/2014/chartex" xmlns:cx1="http://schemas.microsoft.com/office/drawing/2015/9/8/chartex" xmlns:cx2="http://schemas.microsoft.com/office/drawing/2015/10/21/chartex" xmlns:cx3="http://schemas.microsoft.com/office/drawing/2016/5/9/chartex" xmlns:cx4="http://schemas.microsoft.com/office/drawing/2016/5/10/chartex" xmlns:cx5="http://schemas.microsoft.com/office/drawing/2016/5/11/chartex" xmlns:cx6="http://schemas.microsoft.com/office/drawing/2016/5/12/chartex" xmlns:cx7="http://schemas.microsoft.com/office/drawing/2016/5/13/chartex" xmlns:cx8="http://schemas.microsoft.com/office/drawing/2016/5/14/chartex" xmlns:m="http://schemas.openxmlformats.org/officeDocument/2006/math" xmlns:mc="http://schemas.openxmlformats.org/markup-compatibility/2006" xmlns:o="urn:schemas-microsoft-com:office:office" xmlns:oel="http://schemas.microsoft.com/office/2019/extlst" xmlns:r="http://schemas.openxmlformats.org/officeDocument/2006/relationships" xmlns:v="urn:schemas-microsoft-com:vml" xmlns:w="http://schemas.openxmlformats.org/wordprocessingml/2006/main" xmlns:w10="urn:schemas-microsoft-com:office:word" xmlns:w14="http://schemas.microsoft.com/office/word/2010/wordml" xmlns:w15="http://schemas.microsoft.com/office/word/2012/wordml" xmlns:w16="http://schemas.microsoft.com/office/word/2018/wordml" xmlns:w16cex="http://schemas.microsoft.com/office/word/2018/wordml/cex" xmlns:w16cid="http://schemas.microsoft.com/office/word/2016/wordml/cid" xmlns:w16du="http://schemas.microsoft.com/office/word/2023/wordml/word16du" xmlns:w16sdtdh="http://schemas.microsoft.com/office/word/2020/wordml/sdtdatahash" xmlns:w16sdtfl="http://schemas.microsoft.com/office/word/2024/wordml/sdtformatlock" xmlns:w16se="http://schemas.microsoft.com/office/word/2015/wordml/symex" xmlns:wne="http://schemas.microsoft.com/office/word/2006/wordml" xmlns:wp="http://schemas.openxmlformats.org/drawingml/2006/wordprocessingDrawing" xmlns:wp14="http://schemas.microsoft.com/office/word/2010/wordprocessingDrawing" xmlns:wpc="http://schemas.microsoft.com/office/word/2010/wordprocessingCanvas" xmlns:wpg="http://schemas.microsoft.com/office/word/2010/wordprocessingGroup" xmlns:wpi="http://schemas.microsoft.com/office/word/2010/wordprocessingInk" xmlns:wps="http://schemas.microsoft.com/office/word/2010/wordprocessingShape" mc:Ignorable="w14 w15 w16se w16cid w16 w16cex w16sdtdh w16sdtfl w16du wp14">
+  <w:abstractNum w15:restartNumberingAfterBreak="0" w:abstractNumId="0">
     <w:nsid w:val="FFFFFFFB"/>
     <w:multiLevelType w:val="multilevel"/>
     <w:tmpl w:val="FFFFFFFB"/>
@@ -350,21 +985,21 @@
       <w:start w:val="1"/>
       <w:numFmt w:val="upperRoman"/>
       <w:lvlText w:val="%1."/>
-      <w:legacy w:legacy="1" w:legacySpace="144" w:legacyIndent="144"/>
+      <w:legacy w:legacy="1" w:legacyIndent="144" w:legacySpace="144"/>
       <w:lvlJc w:val="left"/>
     </w:lvl>
     <w:lvl w:ilvl="1">
       <w:start w:val="1"/>
       <w:numFmt w:val="upperLetter"/>
       <w:lvlText w:val="%2."/>
-      <w:legacy w:legacy="1" w:legacySpace="144" w:legacyIndent="144"/>
+      <w:legacy w:legacy="1" w:legacyIndent="144" w:legacySpace="144"/>
       <w:lvlJc w:val="left"/>
     </w:lvl>
     <w:lvl w:ilvl="2">
       <w:start w:val="1"/>
       <w:numFmt w:val="decimal"/>
       <w:lvlText w:val="%3)"/>
-      <w:legacy w:legacy="1" w:legacySpace="144" w:legacyIndent="144"/>
+      <w:legacy w:legacy="1" w:legacyIndent="144" w:legacySpace="144"/>
       <w:lvlJc w:val="left"/>
     </w:lvl>
     <w:lvl w:ilvl="3">
@@ -373,61 +1008,61 @@
       <w:lvlText w:val="%4)"/>
       <w:lvlJc w:val="left"/>
       <w:pPr>
-        <w:ind w:left="1152" w:hanging="720"/>
+        <w:ind w:hanging="720" w:left="1152"/>
       </w:pPr>
     </w:lvl>
     <w:lvl w:ilvl="4">
       <w:start w:val="1"/>
       <w:numFmt w:val="decimal"/>
       <w:lvlText w:val="(%5)"/>
-      <w:legacy w:legacy="1" w:legacySpace="0" w:legacyIndent="720"/>
+      <w:legacy w:legacy="1" w:legacyIndent="720" w:legacySpace="0"/>
       <w:lvlJc w:val="left"/>
       <w:pPr>
-        <w:ind w:left="1872" w:hanging="720"/>
+        <w:ind w:hanging="720" w:left="1872"/>
       </w:pPr>
     </w:lvl>
     <w:lvl w:ilvl="5">
       <w:start w:val="1"/>
       <w:numFmt w:val="lowerLetter"/>
       <w:lvlText w:val="(%6)"/>
-      <w:legacy w:legacy="1" w:legacySpace="0" w:legacyIndent="720"/>
+      <w:legacy w:legacy="1" w:legacyIndent="720" w:legacySpace="0"/>
       <w:lvlJc w:val="left"/>
       <w:pPr>
-        <w:ind w:left="2592" w:hanging="720"/>
+        <w:ind w:hanging="720" w:left="2592"/>
       </w:pPr>
     </w:lvl>
     <w:lvl w:ilvl="6">
       <w:start w:val="1"/>
       <w:numFmt w:val="lowerRoman"/>
       <w:lvlText w:val="(%7)"/>
-      <w:legacy w:legacy="1" w:legacySpace="0" w:legacyIndent="720"/>
+      <w:legacy w:legacy="1" w:legacyIndent="720" w:legacySpace="0"/>
       <w:lvlJc w:val="left"/>
       <w:pPr>
-        <w:ind w:left="3312" w:hanging="720"/>
+        <w:ind w:hanging="720" w:left="3312"/>
       </w:pPr>
     </w:lvl>
     <w:lvl w:ilvl="7">
       <w:start w:val="1"/>
       <w:numFmt w:val="lowerLetter"/>
       <w:lvlText w:val="(%8)"/>
-      <w:legacy w:legacy="1" w:legacySpace="0" w:legacyIndent="720"/>
+      <w:legacy w:legacy="1" w:legacyIndent="720" w:legacySpace="0"/>
       <w:lvlJc w:val="left"/>
       <w:pPr>
-        <w:ind w:left="4032" w:hanging="720"/>
+        <w:ind w:hanging="720" w:left="4032"/>
       </w:pPr>
     </w:lvl>
     <w:lvl w:ilvl="8">
       <w:start w:val="1"/>
       <w:numFmt w:val="lowerRoman"/>
       <w:lvlText w:val="(%9)"/>
-      <w:legacy w:legacy="1" w:legacySpace="0" w:legacyIndent="720"/>
+      <w:legacy w:legacy="1" w:legacyIndent="720" w:legacySpace="0"/>
       <w:lvlJc w:val="left"/>
       <w:pPr>
-        <w:ind w:left="4752" w:hanging="720"/>
+        <w:ind w:hanging="720" w:left="4752"/>
       </w:pPr>
     </w:lvl>
   </w:abstractNum>
-  <w:abstractNum w:abstractNumId="1" w15:restartNumberingAfterBreak="0">
+  <w:abstractNum w15:restartNumberingAfterBreak="0" w:abstractNumId="1">
     <w:nsid w:val="2517274C"/>
     <w:multiLevelType w:val="singleLevel"/>
     <w:tmpl w:val="2517274C"/>
@@ -438,13 +1073,13 @@
       <w:lvlJc w:val="left"/>
       <w:pPr>
         <w:tabs>
-          <w:tab w:val="num" w:pos="360"/>
+          <w:tab w:pos="360" w:val="num"/>
         </w:tabs>
-        <w:ind w:left="360" w:hanging="360"/>
+        <w:ind w:hanging="360" w:left="360"/>
       </w:pPr>
     </w:lvl>
   </w:abstractNum>
-  <w:abstractNum w:abstractNumId="2" w15:restartNumberingAfterBreak="0">
+  <w:abstractNum w15:restartNumberingAfterBreak="0" w:abstractNumId="2">
     <w:nsid w:val="3A877D64"/>
     <w:multiLevelType w:val="singleLevel"/>
     <w:tmpl w:val="3A877D64"/>
@@ -455,36 +1090,115 @@
       <w:lvlJc w:val="left"/>
       <w:pPr>
         <w:tabs>
-          <w:tab w:val="num" w:pos="360"/>
+          <w:tab w:pos="360" w:val="num"/>
         </w:tabs>
-        <w:ind w:left="360" w:hanging="360"/>
+        <w:ind w:hanging="360" w:left="360"/>
       </w:pPr>
     </w:lvl>
   </w:abstractNum>
-  <w:num w:numId="1" w16cid:durableId="281426172">
+  <w:abstractNum w:abstractNumId="990">
+    <w:nsid w:val="0000A990"/>
+    <w:multiLevelType w:val="multilevel"/>
+    <w:lvl w:ilvl="0">
+      <w:numFmt w:val="bullet"/>
+      <w:lvlText w:val=" "/>
+      <w:lvlJc w:val="left"/>
+      <w:pPr>
+        <w:ind w:left="720" w:hanging="360"/>
+      </w:pPr>
+    </w:lvl>
+    <w:lvl w:ilvl="1">
+      <w:numFmt w:val="bullet"/>
+      <w:lvlText w:val=" "/>
+      <w:lvlJc w:val="left"/>
+      <w:pPr>
+        <w:ind w:left="1440" w:hanging="360"/>
+      </w:pPr>
+    </w:lvl>
+    <w:lvl w:ilvl="2">
+      <w:numFmt w:val="bullet"/>
+      <w:lvlText w:val=" "/>
+      <w:lvlJc w:val="left"/>
+      <w:pPr>
+        <w:ind w:left="2160" w:hanging="360"/>
+      </w:pPr>
+    </w:lvl>
+    <w:lvl w:ilvl="3">
+      <w:numFmt w:val="bullet"/>
+      <w:lvlText w:val=" "/>
+      <w:lvlJc w:val="left"/>
+      <w:pPr>
+        <w:ind w:left="2880" w:hanging="360"/>
+      </w:pPr>
+    </w:lvl>
+    <w:lvl w:ilvl="4">
+      <w:numFmt w:val="bullet"/>
+      <w:lvlText w:val=" "/>
+      <w:lvlJc w:val="left"/>
+      <w:pPr>
+        <w:ind w:left="3600" w:hanging="360"/>
+      </w:pPr>
+    </w:lvl>
+    <w:lvl w:ilvl="5">
+      <w:numFmt w:val="bullet"/>
+      <w:lvlText w:val=" "/>
+      <w:lvlJc w:val="left"/>
+      <w:pPr>
+        <w:ind w:left="4320" w:hanging="360"/>
+      </w:pPr>
+    </w:lvl>
+    <w:lvl w:ilvl="6">
+      <w:numFmt w:val="bullet"/>
+      <w:lvlText w:val=" "/>
+      <w:lvlJc w:val="left"/>
+      <w:pPr>
+        <w:ind w:left="5040" w:hanging="360"/>
+      </w:pPr>
+    </w:lvl>
+    <w:lvl w:ilvl="7">
+      <w:numFmt w:val="bullet"/>
+      <w:lvlText w:val=" "/>
+      <w:lvlJc w:val="left"/>
+      <w:pPr>
+        <w:ind w:left="5760" w:hanging="360"/>
+      </w:pPr>
+    </w:lvl>
+    <w:lvl w:ilvl="8">
+      <w:numFmt w:val="bullet"/>
+      <w:lvlText w:val=" "/>
+      <w:lvlJc w:val="left"/>
+      <w:pPr>
+        <w:ind w:left="6480" w:hanging="360"/>
+      </w:pPr>
+    </w:lvl>
+  </w:abstractNum>
+  <w:num w16cid:durableId="281426172" w:numId="1">
     <w:abstractNumId w:val="0"/>
   </w:num>
-  <w:num w:numId="2" w16cid:durableId="1625692853">
+  <w:num w16cid:durableId="1625692853" w:numId="2">
     <w:abstractNumId w:val="2"/>
   </w:num>
-  <w:num w:numId="3" w16cid:durableId="916016178">
+  <w:num w16cid:durableId="916016178" w:numId="3">
     <w:abstractNumId w:val="1"/>
+  </w:num>
+  <w:num w:numId="1000">
+    <w:abstractNumId w:val="990"/>
   </w:num>
 </w:numbering>
 </file>
 
 <file path=word/styles.xml><?xml version="1.0" encoding="utf-8"?>
-<w:styles xmlns:mc="http://schemas.openxmlformats.org/markup-compatibility/2006" xmlns:r="http://schemas.openxmlformats.org/officeDocument/2006/relationships" xmlns:w="http://schemas.openxmlformats.org/wordprocessingml/2006/main" xmlns:w14="http://schemas.microsoft.com/office/word/2010/wordml" xmlns:w15="http://schemas.microsoft.com/office/word/2012/wordml" xmlns:w16cex="http://schemas.microsoft.com/office/word/2018/wordml/cex" xmlns:w16cid="http://schemas.microsoft.com/office/word/2016/wordml/cid" xmlns:w16="http://schemas.microsoft.com/office/word/2018/wordml" xmlns:w16du="http://schemas.microsoft.com/office/word/2023/wordml/word16du" xmlns:w16sdtdh="http://schemas.microsoft.com/office/word/2020/wordml/sdtdatahash" xmlns:w16sdtfl="http://schemas.microsoft.com/office/word/2024/wordml/sdtformatlock" xmlns:w16se="http://schemas.microsoft.com/office/word/2015/wordml/symex" mc:Ignorable="w14 w15 w16se w16cid w16 w16cex w16sdtdh w16sdtfl w16du">
+<w:styles xmlns:mc="http://schemas.openxmlformats.org/markup-compatibility/2006" xmlns:r="http://schemas.openxmlformats.org/officeDocument/2006/relationships" xmlns:w="http://schemas.openxmlformats.org/wordprocessingml/2006/main" xmlns:w14="http://schemas.microsoft.com/office/word/2010/wordml" xmlns:w15="http://schemas.microsoft.com/office/word/2012/wordml" xmlns:w16="http://schemas.microsoft.com/office/word/2018/wordml" xmlns:w16cex="http://schemas.microsoft.com/office/word/2018/wordml/cex" xmlns:w16cid="http://schemas.microsoft.com/office/word/2016/wordml/cid" xmlns:w16du="http://schemas.microsoft.com/office/word/2023/wordml/word16du" xmlns:w16sdtdh="http://schemas.microsoft.com/office/word/2020/wordml/sdtdatahash" xmlns:w16sdtfl="http://schemas.microsoft.com/office/word/2024/wordml/sdtformatlock" xmlns:w16se="http://schemas.microsoft.com/office/word/2015/wordml/symex" mc:Ignorable="w14 w15 w16se w16cid w16 w16cex w16sdtdh w16sdtfl w16du">
   <w:docDefaults>
     <w:rPrDefault>
       <w:rPr>
-        <w:rFonts w:ascii="Times New Roman" w:eastAsia="PMingLiU" w:hAnsi="Times New Roman" w:cs="Times New Roman"/>
-        <w:lang w:val="en-US" w:eastAsia="zh-CN" w:bidi="ar-SA"/>
+        <w:rFonts w:ascii="Times New Roman" w:cs="Times New Roman" w:eastAsia="PMingLiU" w:hAnsi="Times New Roman"/>
+        <w:lang w:bidi="ar-SA" w:eastAsia="zh-CN" w:val="en-US"/>
       </w:rPr>
     </w:rPrDefault>
     <w:pPrDefault/>
   </w:docDefaults>
-  <w:latentStyles w:defLockedState="0" w:defUIPriority="0" w:defSemiHidden="0" w:defUnhideWhenUsed="0" w:defQFormat="0" w:count="376">
+  <w:latentStyles w:count="376" w:defLockedState="0" w:defQFormat="0" w:defSemiHidden="0" w:defUIPriority="0" w:defUnhideWhenUsed="0">
     <w:lsdException w:name="Normal" w:qFormat="1"/>
     <w:lsdException w:name="heading 1" w:qFormat="1"/>
     <w:lsdException w:name="heading 2" w:qFormat="1"/>
@@ -496,7 +1210,7 @@
     <w:lsdException w:name="heading 8" w:qFormat="1"/>
     <w:lsdException w:name="heading 9" w:qFormat="1"/>
     <w:lsdException w:name="footnote text" w:semiHidden="1"/>
-    <w:lsdException w:name="caption" w:semiHidden="1" w:unhideWhenUsed="1" w:qFormat="1"/>
+    <w:lsdException w:name="caption" w:qFormat="1" w:semiHidden="1" w:unhideWhenUsed="1"/>
     <w:lsdException w:name="footnote reference" w:semiHidden="1"/>
     <w:lsdException w:name="Title" w:qFormat="1"/>
     <w:lsdException w:name="Default Paragraph Font" w:semiHidden="1"/>
@@ -511,7 +1225,7 @@
     <w:lsdException w:name="Outline List 2" w:semiHidden="1" w:uiPriority="99" w:unhideWhenUsed="1"/>
     <w:lsdException w:name="Outline List 3" w:semiHidden="1" w:uiPriority="99" w:unhideWhenUsed="1"/>
     <w:lsdException w:name="Placeholder Text" w:semiHidden="1" w:uiPriority="99" w:unhideWhenUsed="1"/>
-    <w:lsdException w:name="No Spacing" w:uiPriority="99" w:qFormat="1"/>
+    <w:lsdException w:name="No Spacing" w:qFormat="1" w:uiPriority="99"/>
     <w:lsdException w:name="Light Shading" w:uiPriority="60"/>
     <w:lsdException w:name="Light List" w:uiPriority="61"/>
     <w:lsdException w:name="Light Grid" w:uiPriority="62"/>
@@ -533,9 +1247,9 @@
     <w:lsdException w:name="Medium Shading 2 Accent 1" w:uiPriority="64"/>
     <w:lsdException w:name="Medium List 1 Accent 1" w:uiPriority="65"/>
     <w:lsdException w:name="Revision" w:semiHidden="1" w:uiPriority="99" w:unhideWhenUsed="1"/>
-    <w:lsdException w:name="List Paragraph" w:uiPriority="99" w:qFormat="1"/>
-    <w:lsdException w:name="Quote" w:uiPriority="99" w:qFormat="1"/>
-    <w:lsdException w:name="Intense Quote" w:uiPriority="99" w:qFormat="1"/>
+    <w:lsdException w:name="List Paragraph" w:qFormat="1" w:uiPriority="99"/>
+    <w:lsdException w:name="Quote" w:qFormat="1" w:uiPriority="99"/>
+    <w:lsdException w:name="Intense Quote" w:qFormat="1" w:uiPriority="99"/>
     <w:lsdException w:name="Medium List 2 Accent 1" w:uiPriority="66"/>
     <w:lsdException w:name="Medium Grid 1 Accent 1" w:uiPriority="67"/>
     <w:lsdException w:name="Medium Grid 2 Accent 1" w:uiPriority="68"/>
@@ -614,13 +1328,13 @@
     <w:lsdException w:name="Colorful Shading Accent 6" w:uiPriority="71"/>
     <w:lsdException w:name="Colorful List Accent 6" w:uiPriority="72"/>
     <w:lsdException w:name="Colorful Grid Accent 6" w:uiPriority="73"/>
-    <w:lsdException w:name="Subtle Emphasis" w:uiPriority="19" w:qFormat="1"/>
-    <w:lsdException w:name="Intense Emphasis" w:uiPriority="21" w:qFormat="1"/>
-    <w:lsdException w:name="Subtle Reference" w:uiPriority="31" w:qFormat="1"/>
-    <w:lsdException w:name="Intense Reference" w:uiPriority="32" w:qFormat="1"/>
-    <w:lsdException w:name="Book Title" w:uiPriority="33" w:qFormat="1"/>
+    <w:lsdException w:name="Subtle Emphasis" w:qFormat="1" w:uiPriority="19"/>
+    <w:lsdException w:name="Intense Emphasis" w:qFormat="1" w:uiPriority="21"/>
+    <w:lsdException w:name="Subtle Reference" w:qFormat="1" w:uiPriority="31"/>
+    <w:lsdException w:name="Intense Reference" w:qFormat="1" w:uiPriority="32"/>
+    <w:lsdException w:name="Book Title" w:qFormat="1" w:uiPriority="33"/>
     <w:lsdException w:name="Bibliography" w:semiHidden="1" w:uiPriority="37" w:unhideWhenUsed="1"/>
-    <w:lsdException w:name="TOC Heading" w:semiHidden="1" w:uiPriority="39" w:unhideWhenUsed="1" w:qFormat="1"/>
+    <w:lsdException w:name="TOC Heading" w:qFormat="1" w:semiHidden="1" w:uiPriority="39" w:unhideWhenUsed="1"/>
     <w:lsdException w:name="Plain Table 1" w:uiPriority="41"/>
     <w:lsdException w:name="Plain Table 2" w:uiPriority="42"/>
     <w:lsdException w:name="Plain Table 3" w:uiPriority="43"/>
@@ -731,82 +1445,82 @@
     <w:lsdException w:name="Unresolved Mention" w:semiHidden="1" w:uiPriority="99" w:unhideWhenUsed="1"/>
     <w:lsdException w:name="Smart Link" w:semiHidden="1" w:uiPriority="99" w:unhideWhenUsed="1"/>
   </w:latentStyles>
-  <w:style w:type="paragraph" w:default="1" w:styleId="a">
+  <w:style w:default="1" w:styleId="a" w:type="paragraph">
     <w:name w:val="Normal"/>
     <w:qFormat/>
     <w:pPr>
-      <w:spacing w:before="0" w:after="80" w:line="300" w:lineRule="auto"/>
+      <w:spacing w:after="80" w:before="0" w:line="300" w:lineRule="auto"/>
       <w:jc w:val="both"/>
     </w:pPr>
     <w:rPr>
-      <w:rFonts w:ascii="Arial" w:hAnsi="Arial" w:eastAsia="Calibri" w:cs="Arial"/>
+      <w:rFonts w:ascii="Arial" w:cs="Arial" w:eastAsia="Calibri" w:hAnsi="Arial"/>
       <w:color w:val="1F2937"/>
       <w:sz w:val="22"/>
       <w:szCs w:val="22"/>
       <w:lang w:eastAsia="en-US"/>
     </w:rPr>
   </w:style>
-  <w:style w:type="paragraph" w:styleId="1">
+  <w:style w:styleId="1" w:type="paragraph">
     <w:name w:val="heading 1"/>
     <w:basedOn w:val="a"/>
     <w:next w:val="FirstParagraph"/>
     <w:qFormat/>
     <w:pPr>
       <w:keepNext/>
-      <w:spacing w:before="320" w:after="120" w:line="300" w:lineRule="auto"/>
+      <w:spacing w:after="120" w:before="320" w:line="300" w:lineRule="auto"/>
       <w:pBdr>
-        <w:bottom w:val="single" w:sz="8" w:space="4" w:color="D6E3F3"/>
+        <w:bottom w:color="D6E3F3" w:space="4" w:sz="8" w:val="single"/>
       </w:pBdr>
       <w:jc w:val="left"/>
       <w:outlineLvl w:val="0"/>
     </w:pPr>
     <w:rPr>
-      <w:rFonts w:ascii="Arial" w:hAnsi="Arial" w:eastAsia="Calibri" w:cs="Arial"/>
+      <w:rFonts w:ascii="Arial" w:cs="Arial" w:eastAsia="Calibri" w:hAnsi="Arial"/>
       <w:b/>
       <w:color w:val="2F5597"/>
       <w:sz w:val="30"/>
       <w:szCs w:val="30"/>
     </w:rPr>
   </w:style>
-  <w:style w:type="paragraph" w:styleId="2">
+  <w:style w:styleId="2" w:type="paragraph">
     <w:name w:val="heading 2"/>
     <w:basedOn w:val="a"/>
     <w:next w:val="FirstParagraph"/>
     <w:qFormat/>
     <w:pPr>
       <w:keepNext/>
-      <w:spacing w:before="220" w:after="100" w:line="300" w:lineRule="auto"/>
+      <w:spacing w:after="100" w:before="220" w:line="300" w:lineRule="auto"/>
       <w:jc w:val="left"/>
       <w:outlineLvl w:val="1"/>
     </w:pPr>
     <w:rPr>
-      <w:rFonts w:ascii="Arial" w:hAnsi="Arial" w:eastAsia="Calibri" w:cs="Arial"/>
+      <w:rFonts w:ascii="Arial" w:cs="Arial" w:eastAsia="Calibri" w:hAnsi="Arial"/>
       <w:b/>
       <w:color w:val="2F5597"/>
       <w:sz w:val="26"/>
       <w:szCs w:val="26"/>
     </w:rPr>
   </w:style>
-  <w:style w:type="paragraph" w:styleId="3">
+  <w:style w:styleId="3" w:type="paragraph">
     <w:name w:val="heading 3"/>
     <w:basedOn w:val="a"/>
     <w:next w:val="FirstParagraph"/>
     <w:qFormat/>
     <w:pPr>
       <w:keepNext/>
-      <w:spacing w:before="160" w:after="80" w:line="300" w:lineRule="auto"/>
+      <w:spacing w:after="80" w:before="160" w:line="300" w:lineRule="auto"/>
       <w:jc w:val="left"/>
       <w:outlineLvl w:val="2"/>
     </w:pPr>
     <w:rPr>
-      <w:rFonts w:ascii="Arial" w:hAnsi="Arial" w:eastAsia="Calibri" w:cs="Arial"/>
+      <w:rFonts w:ascii="Arial" w:cs="Arial" w:eastAsia="Calibri" w:hAnsi="Arial"/>
       <w:b/>
       <w:color w:val="3F6AA8"/>
       <w:sz w:val="24"/>
       <w:szCs w:val="24"/>
     </w:rPr>
   </w:style>
-  <w:style w:type="paragraph" w:styleId="4">
+  <w:style w:styleId="4" w:type="paragraph">
     <w:name w:val="heading 4"/>
     <w:basedOn w:val="a"/>
     <w:next w:val="a"/>
@@ -817,8 +1531,8 @@
         <w:ilvl w:val="3"/>
         <w:numId w:val="1"/>
       </w:numPr>
-      <w:spacing w:before="40" w:after="40"/>
-      <w:ind w:left="284" w:firstLine="0"/>
+      <w:spacing w:after="40" w:before="40"/>
+      <w:ind w:firstLine="0" w:left="284"/>
       <w:outlineLvl w:val="3"/>
     </w:pPr>
     <w:rPr>
@@ -828,7 +1542,7 @@
       <w:lang w:eastAsia="zh-TW"/>
     </w:rPr>
   </w:style>
-  <w:style w:type="paragraph" w:styleId="5">
+  <w:style w:styleId="5" w:type="paragraph">
     <w:name w:val="heading 5"/>
     <w:basedOn w:val="a"/>
     <w:next w:val="a"/>
@@ -838,7 +1552,7 @@
         <w:ilvl w:val="4"/>
         <w:numId w:val="1"/>
       </w:numPr>
-      <w:spacing w:before="240" w:after="60"/>
+      <w:spacing w:after="60" w:before="240"/>
       <w:outlineLvl w:val="4"/>
     </w:pPr>
     <w:rPr>
@@ -846,7 +1560,7 @@
       <w:szCs w:val="18"/>
     </w:rPr>
   </w:style>
-  <w:style w:type="paragraph" w:styleId="6">
+  <w:style w:styleId="6" w:type="paragraph">
     <w:name w:val="heading 6"/>
     <w:basedOn w:val="a"/>
     <w:next w:val="a"/>
@@ -856,7 +1570,7 @@
         <w:ilvl w:val="5"/>
         <w:numId w:val="1"/>
       </w:numPr>
-      <w:spacing w:before="240" w:after="60"/>
+      <w:spacing w:after="60" w:before="240"/>
       <w:outlineLvl w:val="5"/>
     </w:pPr>
     <w:rPr>
@@ -866,7 +1580,7 @@
       <w:szCs w:val="16"/>
     </w:rPr>
   </w:style>
-  <w:style w:type="paragraph" w:styleId="7">
+  <w:style w:styleId="7" w:type="paragraph">
     <w:name w:val="heading 7"/>
     <w:basedOn w:val="a"/>
     <w:next w:val="a"/>
@@ -876,7 +1590,7 @@
         <w:ilvl w:val="6"/>
         <w:numId w:val="1"/>
       </w:numPr>
-      <w:spacing w:before="240" w:after="60"/>
+      <w:spacing w:after="60" w:before="240"/>
       <w:outlineLvl w:val="6"/>
     </w:pPr>
     <w:rPr>
@@ -884,7 +1598,7 @@
       <w:szCs w:val="16"/>
     </w:rPr>
   </w:style>
-  <w:style w:type="paragraph" w:styleId="8">
+  <w:style w:styleId="8" w:type="paragraph">
     <w:name w:val="heading 8"/>
     <w:basedOn w:val="a"/>
     <w:next w:val="a"/>
@@ -894,7 +1608,7 @@
         <w:ilvl w:val="7"/>
         <w:numId w:val="1"/>
       </w:numPr>
-      <w:spacing w:before="240" w:after="60"/>
+      <w:spacing w:after="60" w:before="240"/>
       <w:outlineLvl w:val="7"/>
     </w:pPr>
     <w:rPr>
@@ -904,7 +1618,7 @@
       <w:szCs w:val="16"/>
     </w:rPr>
   </w:style>
-  <w:style w:type="paragraph" w:styleId="9">
+  <w:style w:styleId="9" w:type="paragraph">
     <w:name w:val="heading 9"/>
     <w:basedOn w:val="a"/>
     <w:next w:val="a"/>
@@ -914,7 +1628,7 @@
         <w:ilvl w:val="8"/>
         <w:numId w:val="1"/>
       </w:numPr>
-      <w:spacing w:before="240" w:after="60"/>
+      <w:spacing w:after="60" w:before="240"/>
       <w:outlineLvl w:val="8"/>
     </w:pPr>
     <w:rPr>
@@ -922,64 +1636,64 @@
       <w:szCs w:val="16"/>
     </w:rPr>
   </w:style>
-  <w:style w:type="character" w:default="1" w:styleId="a0">
+  <w:style w:default="1" w:styleId="a0" w:type="character">
     <w:name w:val="Default Paragraph Font"/>
     <w:semiHidden/>
   </w:style>
-  <w:style w:type="table" w:default="1" w:styleId="a1">
+  <w:style w:default="1" w:styleId="a1" w:type="table">
     <w:name w:val="Normal Table"/>
     <w:semiHidden/>
     <w:tblPr>
       <w:tblCellMar>
-        <w:top w:w="0" w:type="dxa"/>
-        <w:left w:w="108" w:type="dxa"/>
-        <w:bottom w:w="0" w:type="dxa"/>
-        <w:right w:w="108" w:type="dxa"/>
+        <w:top w:type="dxa" w:w="0"/>
+        <w:left w:type="dxa" w:w="108"/>
+        <w:bottom w:type="dxa" w:w="0"/>
+        <w:right w:type="dxa" w:w="108"/>
       </w:tblCellMar>
     </w:tblPr>
   </w:style>
-  <w:style w:type="numbering" w:default="1" w:styleId="a2">
+  <w:style w:default="1" w:styleId="a2" w:type="numbering">
     <w:name w:val="No List"/>
     <w:uiPriority w:val="99"/>
     <w:semiHidden/>
     <w:unhideWhenUsed/>
   </w:style>
-  <w:style w:type="character" w:styleId="a3">
+  <w:style w:styleId="a3" w:type="character">
     <w:name w:val="footnote reference"/>
     <w:semiHidden/>
     <w:rPr>
       <w:vertAlign w:val="superscript"/>
     </w:rPr>
   </w:style>
-  <w:style w:type="character" w:styleId="a4">
+  <w:style w:styleId="a4" w:type="character">
     <w:name w:val="page number"/>
     <w:basedOn w:val="a0"/>
   </w:style>
-  <w:style w:type="character" w:styleId="a5">
+  <w:style w:styleId="a5" w:type="character">
     <w:name w:val="FollowedHyperlink"/>
     <w:rPr>
       <w:color w:val="800080"/>
       <w:u w:val="single"/>
     </w:rPr>
   </w:style>
-  <w:style w:type="character" w:styleId="a6">
+  <w:style w:styleId="a6" w:type="character">
     <w:name w:val="Hyperlink"/>
     <w:rPr>
       <w:color w:val="0000FF"/>
       <w:u w:val="single"/>
     </w:rPr>
   </w:style>
-  <w:style w:type="character" w:customStyle="1" w:styleId="MemberType">
+  <w:style w:customStyle="1" w:styleId="MemberType" w:type="character">
     <w:name w:val="MemberType"/>
     <w:rPr>
-      <w:rFonts w:ascii="Times New Roman" w:hAnsi="Times New Roman" w:cs="Times New Roman"/>
+      <w:rFonts w:ascii="Times New Roman" w:cs="Times New Roman" w:hAnsi="Times New Roman"/>
       <w:i/>
       <w:iCs/>
       <w:sz w:val="22"/>
       <w:szCs w:val="22"/>
     </w:rPr>
   </w:style>
-  <w:style w:type="character" w:customStyle="1" w:styleId="figurecaptionChar">
+  <w:style w:customStyle="1" w:styleId="figurecaptionChar" w:type="character">
     <w:name w:val="figure caption Char"/>
     <w:basedOn w:val="FigureCaptionChar0"/>
     <w:link w:val="figurecaption"/>
@@ -989,7 +1703,7 @@
       <w:lang w:eastAsia="en-US"/>
     </w:rPr>
   </w:style>
-  <w:style w:type="character" w:customStyle="1" w:styleId="FigureCaptionChar0">
+  <w:style w:customStyle="1" w:styleId="FigureCaptionChar0" w:type="character">
     <w:name w:val="Figure Caption Char"/>
     <w:link w:val="FigureCaption0"/>
     <w:rPr>
@@ -998,24 +1712,24 @@
       <w:lang w:eastAsia="en-US"/>
     </w:rPr>
   </w:style>
-  <w:style w:type="paragraph" w:styleId="a7">
+  <w:style w:styleId="a7" w:type="paragraph">
     <w:name w:val="Title"/>
     <w:basedOn w:val="a"/>
     <w:next w:val="FirstParagraph"/>
     <w:qFormat/>
     <w:pPr>
-      <w:spacing w:before="0" w:after="300" w:line="360" w:lineRule="auto"/>
+      <w:spacing w:after="300" w:before="0" w:line="360" w:lineRule="auto"/>
       <w:jc w:val="center"/>
     </w:pPr>
     <w:rPr>
-      <w:rFonts w:ascii="Arial" w:hAnsi="Arial" w:eastAsia="Calibri" w:cs="Arial"/>
+      <w:rFonts w:ascii="Arial" w:cs="Arial" w:eastAsia="Calibri" w:hAnsi="Arial"/>
       <w:b/>
       <w:color w:val="17365D"/>
       <w:sz w:val="38"/>
       <w:szCs w:val="38"/>
     </w:rPr>
   </w:style>
-  <w:style w:type="paragraph" w:styleId="a8">
+  <w:style w:styleId="a8" w:type="paragraph">
     <w:name w:val="footnote text"/>
     <w:basedOn w:val="a"/>
     <w:semiHidden/>
@@ -1028,37 +1742,37 @@
       <w:szCs w:val="16"/>
     </w:rPr>
   </w:style>
-  <w:style w:type="paragraph" w:styleId="a9">
+  <w:style w:styleId="a9" w:type="paragraph">
     <w:name w:val="Body Text Indent"/>
     <w:basedOn w:val="a"/>
     <w:pPr>
-      <w:ind w:left="630" w:hanging="630"/>
+      <w:ind w:hanging="630" w:left="630"/>
     </w:pPr>
     <w:rPr>
       <w:szCs w:val="24"/>
     </w:rPr>
   </w:style>
-  <w:style w:type="paragraph" w:styleId="aa">
+  <w:style w:styleId="aa" w:type="paragraph">
     <w:name w:val="footer"/>
     <w:basedOn w:val="a"/>
     <w:pPr>
       <w:tabs>
-        <w:tab w:val="center" w:pos="4320"/>
-        <w:tab w:val="right" w:pos="8640"/>
+        <w:tab w:pos="4320" w:val="center"/>
+        <w:tab w:pos="8640" w:val="right"/>
       </w:tabs>
     </w:pPr>
   </w:style>
-  <w:style w:type="paragraph" w:styleId="ab">
+  <w:style w:styleId="ab" w:type="paragraph">
     <w:name w:val="header"/>
     <w:basedOn w:val="a"/>
     <w:pPr>
       <w:tabs>
-        <w:tab w:val="center" w:pos="4320"/>
-        <w:tab w:val="right" w:pos="8640"/>
+        <w:tab w:pos="4320" w:val="center"/>
+        <w:tab w:pos="8640" w:val="right"/>
       </w:tabs>
     </w:pPr>
   </w:style>
-  <w:style w:type="paragraph" w:customStyle="1" w:styleId="Abstract">
+  <w:style w:customStyle="1" w:styleId="Abstract" w:type="paragraph">
     <w:name w:val="Abstract"/>
     <w:basedOn w:val="a"/>
     <w:next w:val="a"/>
@@ -1074,20 +1788,20 @@
       <w:szCs w:val="18"/>
     </w:rPr>
   </w:style>
-  <w:style w:type="paragraph" w:customStyle="1" w:styleId="Equation">
+  <w:style w:customStyle="1" w:styleId="Equation" w:type="paragraph">
     <w:name w:val="Equation"/>
     <w:basedOn w:val="a"/>
     <w:next w:val="a"/>
     <w:pPr>
       <w:widowControl w:val="0"/>
       <w:tabs>
-        <w:tab w:val="right" w:pos="5040"/>
+        <w:tab w:pos="5040" w:val="right"/>
       </w:tabs>
       <w:spacing w:line="252" w:lineRule="auto"/>
       <w:jc w:val="both"/>
     </w:pPr>
   </w:style>
-  <w:style w:type="paragraph" w:customStyle="1" w:styleId="References">
+  <w:style w:customStyle="1" w:styleId="References" w:type="paragraph">
     <w:name w:val="References"/>
     <w:basedOn w:val="a"/>
     <w:pPr>
@@ -1095,7 +1809,7 @@
         <w:numId w:val="2"/>
       </w:numPr>
       <w:tabs>
-        <w:tab w:val="left" w:pos="360"/>
+        <w:tab w:pos="360" w:val="left"/>
       </w:tabs>
       <w:jc w:val="both"/>
     </w:pPr>
@@ -1104,12 +1818,12 @@
       <w:szCs w:val="16"/>
     </w:rPr>
   </w:style>
-  <w:style w:type="paragraph" w:customStyle="1" w:styleId="Authors">
+  <w:style w:customStyle="1" w:styleId="Authors" w:type="paragraph">
     <w:name w:val="Authors"/>
     <w:basedOn w:val="a"/>
     <w:next w:val="a"/>
     <w:pPr>
-      <w:framePr w:w="9072" w:hSpace="187" w:vSpace="187" w:wrap="notBeside" w:vAnchor="text" w:hAnchor="page" w:xAlign="center" w:y="1"/>
+      <w:framePr w:hAnchor="page" w:hSpace="187" w:vAnchor="text" w:vSpace="187" w:w="9072" w:wrap="notBeside" w:xAlign="center" w:y="1"/>
       <w:spacing w:after="320"/>
       <w:jc w:val="center"/>
     </w:pPr>
@@ -1118,23 +1832,23 @@
       <w:szCs w:val="22"/>
     </w:rPr>
   </w:style>
-  <w:style w:type="paragraph" w:customStyle="1" w:styleId="TableTitle">
+  <w:style w:customStyle="1" w:styleId="TableTitle" w:type="paragraph">
     <w:name w:val="Table Title"/>
     <w:basedOn w:val="a"/>
     <w:next w:val="Compact"/>
     <w:pPr>
-      <w:spacing w:before="80" w:after="40" w:line="240" w:lineRule="auto"/>
+      <w:spacing w:after="40" w:before="80" w:line="240" w:lineRule="auto"/>
       <w:jc w:val="left"/>
     </w:pPr>
     <w:rPr>
-      <w:rFonts w:ascii="Arial" w:hAnsi="Arial" w:eastAsia="Calibri" w:cs="Arial"/>
+      <w:rFonts w:ascii="Arial" w:cs="Arial" w:eastAsia="Calibri" w:hAnsi="Arial"/>
       <w:b/>
       <w:color w:val="44546A"/>
       <w:sz w:val="20"/>
       <w:szCs w:val="20"/>
     </w:rPr>
   </w:style>
-  <w:style w:type="paragraph" w:customStyle="1" w:styleId="Text">
+  <w:style w:customStyle="1" w:styleId="Text" w:type="paragraph">
     <w:name w:val="Text"/>
     <w:basedOn w:val="a"/>
     <w:pPr>
@@ -1144,7 +1858,7 @@
       <w:jc w:val="both"/>
     </w:pPr>
   </w:style>
-  <w:style w:type="paragraph" w:customStyle="1" w:styleId="IndexTerms">
+  <w:style w:customStyle="1" w:styleId="IndexTerms" w:type="paragraph">
     <w:name w:val="IndexTerms"/>
     <w:basedOn w:val="a"/>
     <w:next w:val="a"/>
@@ -1159,23 +1873,23 @@
       <w:szCs w:val="18"/>
     </w:rPr>
   </w:style>
-  <w:style w:type="paragraph" w:customStyle="1" w:styleId="FigureCaption0">
+  <w:style w:customStyle="1" w:styleId="FigureCaption0" w:type="paragraph">
     <w:name w:val="Figure Caption"/>
     <w:basedOn w:val="a"/>
     <w:link w:val="FigureCaptionChar0"/>
     <w:pPr>
-      <w:spacing w:before="40" w:after="60" w:line="240" w:lineRule="auto"/>
+      <w:spacing w:after="60" w:before="40" w:line="240" w:lineRule="auto"/>
       <w:jc w:val="center"/>
     </w:pPr>
     <w:rPr>
-      <w:rFonts w:ascii="Arial" w:hAnsi="Arial" w:eastAsia="Calibri" w:cs="Arial"/>
+      <w:rFonts w:ascii="Arial" w:cs="Arial" w:eastAsia="Calibri" w:hAnsi="Arial"/>
       <w:i/>
       <w:color w:val="44546A"/>
       <w:sz w:val="20"/>
       <w:szCs w:val="20"/>
     </w:rPr>
   </w:style>
-  <w:style w:type="paragraph" w:customStyle="1" w:styleId="ReferenceHead">
+  <w:style w:customStyle="1" w:styleId="ReferenceHead" w:type="paragraph">
     <w:name w:val="Reference Head"/>
     <w:basedOn w:val="1"/>
     <w:pPr>
@@ -1184,7 +1898,7 @@
       </w:numPr>
     </w:pPr>
   </w:style>
-  <w:style w:type="paragraph" w:customStyle="1" w:styleId="figurecaption">
+  <w:style w:customStyle="1" w:styleId="figurecaption" w:type="paragraph">
     <w:name w:val="figure caption"/>
     <w:basedOn w:val="FigureCaption0"/>
     <w:link w:val="figurecaptionChar"/>
@@ -1193,84 +1907,310 @@
       <w:jc w:val="center"/>
     </w:pPr>
   </w:style>
-  <w:style w:type="table" w:styleId="ac">
+  <w:style w:styleId="ac" w:type="table">
     <w:name w:val="Table Grid"/>
     <w:basedOn w:val="a1"/>
     <w:tblPr>
       <w:tblBorders>
-        <w:top w:val="single" w:sz="6" w:space="0" w:color="B8CCE4"/>
-        <w:left w:val="single" w:sz="6" w:space="0" w:color="B8CCE4"/>
-        <w:bottom w:val="single" w:sz="6" w:space="0" w:color="B8CCE4"/>
-        <w:right w:val="single" w:sz="6" w:space="0" w:color="B8CCE4"/>
-        <w:insideH w:val="single" w:sz="6" w:space="0" w:color="DCE6F1"/>
-        <w:insideV w:val="single" w:sz="6" w:space="0" w:color="DCE6F1"/>
+        <w:top w:color="B8CCE4" w:space="0" w:sz="6" w:val="single"/>
+        <w:left w:color="B8CCE4" w:space="0" w:sz="6" w:val="single"/>
+        <w:bottom w:color="B8CCE4" w:space="0" w:sz="6" w:val="single"/>
+        <w:right w:color="B8CCE4" w:space="0" w:sz="6" w:val="single"/>
+        <w:insideH w:color="DCE6F1" w:space="0" w:sz="6" w:val="single"/>
+        <w:insideV w:color="DCE6F1" w:space="0" w:sz="6" w:val="single"/>
       </w:tblBorders>
       <w:tblCellMar>
-        <w:top w:w="60" w:type="dxa"/>
-        <w:left w:w="120" w:type="dxa"/>
-        <w:bottom w:w="60" w:type="dxa"/>
-        <w:right w:w="120" w:type="dxa"/>
+        <w:top w:type="dxa" w:w="60"/>
+        <w:left w:type="dxa" w:w="120"/>
+        <w:bottom w:type="dxa" w:w="60"/>
+        <w:right w:type="dxa" w:w="120"/>
       </w:tblCellMar>
     </w:tblPr>
   </w:style>
-  <w:style w:type="paragraph" w:customStyle="1" w:styleId="FirstParagraph">
+  <w:style w:customStyle="1" w:styleId="FirstParagraph" w:type="paragraph">
     <w:name w:val="First Paragraph"/>
     <w:basedOn w:val="a"/>
     <w:next w:val="a"/>
     <w:qFormat/>
     <w:pPr>
-      <w:spacing w:before="0" w:after="80" w:line="300" w:lineRule="auto"/>
+      <w:spacing w:after="80" w:before="0" w:line="300" w:lineRule="auto"/>
       <w:jc w:val="both"/>
     </w:pPr>
     <w:rPr>
-      <w:rFonts w:ascii="Arial" w:hAnsi="Arial" w:eastAsia="Calibri" w:cs="Arial"/>
+      <w:rFonts w:ascii="Arial" w:cs="Arial" w:eastAsia="Calibri" w:hAnsi="Arial"/>
       <w:color w:val="1F2937"/>
       <w:sz w:val="22"/>
       <w:szCs w:val="22"/>
     </w:rPr>
   </w:style>
-  <w:style w:type="paragraph" w:customStyle="1" w:styleId="Compact">
+  <w:style w:customStyle="1" w:styleId="Compact" w:type="paragraph">
     <w:name w:val="Compact"/>
     <w:basedOn w:val="a"/>
     <w:qFormat/>
     <w:pPr>
-      <w:spacing w:before="0" w:after="20" w:line="264" w:lineRule="auto"/>
+      <w:spacing w:after="20" w:before="0" w:line="264" w:lineRule="auto"/>
       <w:jc w:val="left"/>
     </w:pPr>
     <w:rPr>
-      <w:rFonts w:ascii="Arial" w:hAnsi="Arial" w:eastAsia="Calibri" w:cs="Arial"/>
+      <w:rFonts w:ascii="Arial" w:cs="Arial" w:eastAsia="Calibri" w:hAnsi="Arial"/>
       <w:color w:val="1F2937"/>
       <w:sz w:val="20"/>
       <w:szCs w:val="20"/>
     </w:rPr>
   </w:style>
-  <w:style w:type="paragraph" w:customStyle="1" w:styleId="SourceCode">
+  <w:style w:customStyle="1" w:styleId="SourceCode" w:type="paragraph">
     <w:name w:val="Source Code"/>
     <w:basedOn w:val="a"/>
     <w:next w:val="a"/>
     <w:link w:val="VerbatimChar"/>
     <w:pPr>
-      <w:spacing w:before="40" w:after="80" w:line="252" w:lineRule="auto"/>
+      <w:spacing w:after="80" w:before="40" w:line="252" w:lineRule="auto"/>
       <w:ind w:left="180" w:right="180"/>
-      <w:shd w:val="clear" w:color="auto" w:fill="F8FAFC"/>
+      <w:shd w:color="auto" w:fill="F8FAFC" w:val="clear"/>
       <w:wordWrap w:val="off"/>
     </w:pPr>
     <w:rPr>
-      <w:rFonts w:ascii="Consolas" w:hAnsi="Consolas" w:eastAsia="Consolas" w:cs="Consolas"/>
+      <w:rFonts w:ascii="Consolas" w:cs="Consolas" w:eastAsia="Consolas" w:hAnsi="Consolas"/>
       <w:color w:val="334155"/>
       <w:sz w:val="20"/>
       <w:szCs w:val="20"/>
     </w:rPr>
   </w:style>
-  <w:style w:type="character" w:customStyle="1" w:styleId="VerbatimChar">
+  <w:style w:customStyle="1" w:styleId="VerbatimChar" w:type="character">
     <w:name w:val="Verbatim Char"/>
     <w:basedOn w:val="a0"/>
     <w:rPr>
-      <w:rFonts w:ascii="Consolas" w:hAnsi="Consolas" w:eastAsia="Consolas" w:cs="Consolas"/>
+      <w:rFonts w:ascii="Consolas" w:cs="Consolas" w:eastAsia="Consolas" w:hAnsi="Consolas"/>
       <w:color w:val="334155"/>
       <w:sz w:val="20"/>
       <w:szCs w:val="20"/>
     </w:rPr>
+  </w:style>
+  <w:style w:type="character" w:customStyle="1" w:styleId="KeywordTok">
+    <w:name w:val="KeywordTok"/>
+    <w:basedOn w:val="VerbatimChar"/>
+    <w:rPr>
+      <w:b/>
+      <w:color w:val="007020"/>
+    </w:rPr>
+  </w:style>
+  <w:style w:type="character" w:customStyle="1" w:styleId="DataTypeTok">
+    <w:name w:val="DataTypeTok"/>
+    <w:basedOn w:val="VerbatimChar"/>
+    <w:rPr>
+      <w:color w:val="902000"/>
+    </w:rPr>
+  </w:style>
+  <w:style w:type="character" w:customStyle="1" w:styleId="DecValTok">
+    <w:name w:val="DecValTok"/>
+    <w:basedOn w:val="VerbatimChar"/>
+    <w:rPr>
+      <w:color w:val="40a070"/>
+    </w:rPr>
+  </w:style>
+  <w:style w:type="character" w:customStyle="1" w:styleId="BaseNTok">
+    <w:name w:val="BaseNTok"/>
+    <w:basedOn w:val="VerbatimChar"/>
+    <w:rPr>
+      <w:color w:val="40a070"/>
+    </w:rPr>
+  </w:style>
+  <w:style w:type="character" w:customStyle="1" w:styleId="FloatTok">
+    <w:name w:val="FloatTok"/>
+    <w:basedOn w:val="VerbatimChar"/>
+    <w:rPr>
+      <w:color w:val="40a070"/>
+    </w:rPr>
+  </w:style>
+  <w:style w:type="character" w:customStyle="1" w:styleId="ConstantTok">
+    <w:name w:val="ConstantTok"/>
+    <w:basedOn w:val="VerbatimChar"/>
+    <w:rPr>
+      <w:color w:val="880000"/>
+    </w:rPr>
+  </w:style>
+  <w:style w:type="character" w:customStyle="1" w:styleId="CharTok">
+    <w:name w:val="CharTok"/>
+    <w:basedOn w:val="VerbatimChar"/>
+    <w:rPr>
+      <w:color w:val="4070a0"/>
+    </w:rPr>
+  </w:style>
+  <w:style w:type="character" w:customStyle="1" w:styleId="SpecialCharTok">
+    <w:name w:val="SpecialCharTok"/>
+    <w:basedOn w:val="VerbatimChar"/>
+    <w:rPr>
+      <w:color w:val="4070a0"/>
+    </w:rPr>
+  </w:style>
+  <w:style w:type="character" w:customStyle="1" w:styleId="StringTok">
+    <w:name w:val="StringTok"/>
+    <w:basedOn w:val="VerbatimChar"/>
+    <w:rPr>
+      <w:color w:val="4070a0"/>
+    </w:rPr>
+  </w:style>
+  <w:style w:type="character" w:customStyle="1" w:styleId="VerbatimStringTok">
+    <w:name w:val="VerbatimStringTok"/>
+    <w:basedOn w:val="VerbatimChar"/>
+    <w:rPr>
+      <w:color w:val="4070a0"/>
+    </w:rPr>
+  </w:style>
+  <w:style w:type="character" w:customStyle="1" w:styleId="SpecialStringTok">
+    <w:name w:val="SpecialStringTok"/>
+    <w:basedOn w:val="VerbatimChar"/>
+    <w:rPr>
+      <w:color w:val="bb6688"/>
+    </w:rPr>
+  </w:style>
+  <w:style w:type="character" w:customStyle="1" w:styleId="ImportTok">
+    <w:name w:val="ImportTok"/>
+    <w:basedOn w:val="VerbatimChar"/>
+    <w:rPr>
+      <w:b/>
+      <w:color w:val="008000"/>
+    </w:rPr>
+  </w:style>
+  <w:style w:type="character" w:customStyle="1" w:styleId="CommentTok">
+    <w:name w:val="CommentTok"/>
+    <w:basedOn w:val="VerbatimChar"/>
+    <w:rPr>
+      <w:i/>
+      <w:color w:val="60a0b0"/>
+    </w:rPr>
+  </w:style>
+  <w:style w:type="character" w:customStyle="1" w:styleId="DocumentationTok">
+    <w:name w:val="DocumentationTok"/>
+    <w:basedOn w:val="VerbatimChar"/>
+    <w:rPr>
+      <w:i/>
+      <w:color w:val="ba2121"/>
+    </w:rPr>
+  </w:style>
+  <w:style w:type="character" w:customStyle="1" w:styleId="AnnotationTok">
+    <w:name w:val="AnnotationTok"/>
+    <w:basedOn w:val="VerbatimChar"/>
+    <w:rPr>
+      <w:b/>
+      <w:i/>
+      <w:color w:val="60a0b0"/>
+    </w:rPr>
+  </w:style>
+  <w:style w:type="character" w:customStyle="1" w:styleId="CommentVarTok">
+    <w:name w:val="CommentVarTok"/>
+    <w:basedOn w:val="VerbatimChar"/>
+    <w:rPr>
+      <w:b/>
+      <w:i/>
+      <w:color w:val="60a0b0"/>
+    </w:rPr>
+  </w:style>
+  <w:style w:type="character" w:customStyle="1" w:styleId="OtherTok">
+    <w:name w:val="OtherTok"/>
+    <w:basedOn w:val="VerbatimChar"/>
+    <w:rPr>
+      <w:color w:val="007020"/>
+    </w:rPr>
+  </w:style>
+  <w:style w:type="character" w:customStyle="1" w:styleId="FunctionTok">
+    <w:name w:val="FunctionTok"/>
+    <w:basedOn w:val="VerbatimChar"/>
+    <w:rPr>
+      <w:color w:val="06287e"/>
+    </w:rPr>
+  </w:style>
+  <w:style w:type="character" w:customStyle="1" w:styleId="VariableTok">
+    <w:name w:val="VariableTok"/>
+    <w:basedOn w:val="VerbatimChar"/>
+    <w:rPr>
+      <w:color w:val="19177c"/>
+    </w:rPr>
+  </w:style>
+  <w:style w:type="character" w:customStyle="1" w:styleId="ControlFlowTok">
+    <w:name w:val="ControlFlowTok"/>
+    <w:basedOn w:val="VerbatimChar"/>
+    <w:rPr>
+      <w:b/>
+      <w:color w:val="007020"/>
+    </w:rPr>
+  </w:style>
+  <w:style w:type="character" w:customStyle="1" w:styleId="OperatorTok">
+    <w:name w:val="OperatorTok"/>
+    <w:basedOn w:val="VerbatimChar"/>
+    <w:rPr>
+      <w:color w:val="666666"/>
+    </w:rPr>
+  </w:style>
+  <w:style w:type="character" w:customStyle="1" w:styleId="BuiltInTok">
+    <w:name w:val="BuiltInTok"/>
+    <w:basedOn w:val="VerbatimChar"/>
+    <w:rPr>
+      <w:color w:val="008000"/>
+    </w:rPr>
+  </w:style>
+  <w:style w:type="character" w:customStyle="1" w:styleId="ExtensionTok">
+    <w:name w:val="ExtensionTok"/>
+    <w:basedOn w:val="VerbatimChar"/>
+    <w:rPr/>
+  </w:style>
+  <w:style w:type="character" w:customStyle="1" w:styleId="PreprocessorTok">
+    <w:name w:val="PreprocessorTok"/>
+    <w:basedOn w:val="VerbatimChar"/>
+    <w:rPr>
+      <w:color w:val="bc7a00"/>
+    </w:rPr>
+  </w:style>
+  <w:style w:type="character" w:customStyle="1" w:styleId="AttributeTok">
+    <w:name w:val="AttributeTok"/>
+    <w:basedOn w:val="VerbatimChar"/>
+    <w:rPr>
+      <w:color w:val="7d9029"/>
+    </w:rPr>
+  </w:style>
+  <w:style w:type="character" w:customStyle="1" w:styleId="RegionMarkerTok">
+    <w:name w:val="RegionMarkerTok"/>
+    <w:basedOn w:val="VerbatimChar"/>
+    <w:rPr/>
+  </w:style>
+  <w:style w:type="character" w:customStyle="1" w:styleId="InformationTok">
+    <w:name w:val="InformationTok"/>
+    <w:basedOn w:val="VerbatimChar"/>
+    <w:rPr>
+      <w:b/>
+      <w:i/>
+      <w:color w:val="60a0b0"/>
+    </w:rPr>
+  </w:style>
+  <w:style w:type="character" w:customStyle="1" w:styleId="WarningTok">
+    <w:name w:val="WarningTok"/>
+    <w:basedOn w:val="VerbatimChar"/>
+    <w:rPr>
+      <w:b/>
+      <w:i/>
+      <w:color w:val="60a0b0"/>
+    </w:rPr>
+  </w:style>
+  <w:style w:type="character" w:customStyle="1" w:styleId="AlertTok">
+    <w:name w:val="AlertTok"/>
+    <w:basedOn w:val="VerbatimChar"/>
+    <w:rPr>
+      <w:b/>
+      <w:color w:val="ff0000"/>
+    </w:rPr>
+  </w:style>
+  <w:style w:type="character" w:customStyle="1" w:styleId="ErrorTok">
+    <w:name w:val="ErrorTok"/>
+    <w:basedOn w:val="VerbatimChar"/>
+    <w:rPr>
+      <w:b/>
+      <w:color w:val="ff0000"/>
+    </w:rPr>
+  </w:style>
+  <w:style w:type="character" w:customStyle="1" w:styleId="NormalTok">
+    <w:name w:val="NormalTok"/>
+    <w:basedOn w:val="VerbatimChar"/>
+    <w:rPr/>
   </w:style>
 </w:styles>
 </file>

</xml_diff>

<commit_message>
Replace risky academic template and sanitize docx metadata
</commit_message>
<xml_diff>
--- a/multi-templates/reference_english_business.docx
+++ b/multi-templates/reference_english_business.docx
@@ -1,5 +1,48 @@
 
-<file path=word/document.xml><?xml version="1.0" encoding="utf-8"?>
+<file path=docProps\app.xml><?xml version="1.0" encoding="utf-8"?>
+<Properties xmlns="http://schemas.openxmlformats.org/officeDocument/2006/extended-properties" xmlns:vt="http://schemas.openxmlformats.org/officeDocument/2006/docPropsVTypes">
+  <Template>Normal.dotm</Template>
+  <TotalTime>0</TotalTime>
+  <Pages>1</Pages>
+  <Words>0</Words>
+  <Characters>0</Characters>
+  <Application>Microsoft Office Word</Application>
+  <DocSecurity>4</DocSecurity>
+  <Lines>0</Lines>
+  <Paragraphs>0</Paragraphs>
+  <ScaleCrop>false</ScaleCrop>
+  <Company>
+  </Company>
+  <LinksUpToDate>false</LinksUpToDate>
+  <CharactersWithSpaces>0</CharactersWithSpaces>
+  <SharedDoc>false</SharedDoc>
+  <HyperlinksChanged>false</HyperlinksChanged>
+  <AppVersion>16.0000</AppVersion>
+</Properties>
+</file>
+
+<file path=docProps\core.xml><?xml version="1.0" encoding="utf-8"?>
+<cp:coreProperties xmlns:cp="http://schemas.openxmlformats.org/package/2006/metadata/core-properties" xmlns:dc="http://purl.org/dc/elements/1.1/" xmlns:dcterms="http://purl.org/dc/terms/" xmlns:dcmitype="http://purl.org/dc/dcmitype/" xmlns:xsi="http://www.w3.org/2001/XMLSchema-instance">
+  <dc:title>
+  </dc:title>
+  <dc:creator>
+  </dc:creator>
+  <cp:keywords>
+  </cp:keywords>
+  <dcterms:created xsi:type="dcterms:W3CDTF">2026-04-28T16:08:26Z</dcterms:created>
+  <dcterms:modified xsi:type="dcterms:W3CDTF">2026-04-28T16:08:26Z</dcterms:modified>
+</cp:coreProperties>
+</file>
+
+<file path=docProps\custom.xml><?xml version="1.0" encoding="utf-8"?>
+<Properties xmlns="http://schemas.openxmlformats.org/officeDocument/2006/custom-properties" xmlns:vt="http://schemas.openxmlformats.org/officeDocument/2006/docPropsVTypes"/>
+</file>
+
+<file path=word\comments.xml><?xml version="1.0" encoding="utf-8"?>
+<w:comments xmlns:w="http://schemas.openxmlformats.org/wordprocessingml/2006/main" xmlns:m="http://schemas.openxmlformats.org/officeDocument/2006/math" xmlns:r="http://schemas.openxmlformats.org/officeDocument/2006/relationships" xmlns:o="urn:schemas-microsoft-com:office:office" xmlns:v="urn:schemas-microsoft-com:vml" xmlns:w10="urn:schemas-microsoft-com:office:word" xmlns:a="http://schemas.openxmlformats.org/drawingml/2006/main" xmlns:pic="http://schemas.openxmlformats.org/drawingml/2006/picture" xmlns:wp="http://schemas.openxmlformats.org/drawingml/2006/wordprocessingDrawing"/>
+</file>
+
+<file path=word\document.xml><?xml version="1.0" encoding="utf-8"?>
 <w:document xmlns:w="http://schemas.openxmlformats.org/wordprocessingml/2006/main" xmlns:m="http://schemas.openxmlformats.org/officeDocument/2006/math" xmlns:r="http://schemas.openxmlformats.org/officeDocument/2006/relationships" xmlns:o="urn:schemas-microsoft-com:office:office" xmlns:v="urn:schemas-microsoft-com:vml" xmlns:w10="urn:schemas-microsoft-com:office:word" xmlns:a="http://schemas.openxmlformats.org/drawingml/2006/main" xmlns:pic="http://schemas.openxmlformats.org/drawingml/2006/picture" xmlns:wp="http://schemas.openxmlformats.org/drawingml/2006/wordprocessingDrawing">
   <w:body>
     <w:bookmarkStart w:id="22" w:name="business-report-reference-template"/>
@@ -934,11 +977,63 @@
 </w:document>
 </file>
 
-<file path=word/comments.xml><?xml version="1.0" encoding="utf-8"?>
-<w:comments xmlns:w="http://schemas.openxmlformats.org/wordprocessingml/2006/main" xmlns:m="http://schemas.openxmlformats.org/officeDocument/2006/math" xmlns:r="http://schemas.openxmlformats.org/officeDocument/2006/relationships" xmlns:o="urn:schemas-microsoft-com:office:office" xmlns:v="urn:schemas-microsoft-com:vml" xmlns:w10="urn:schemas-microsoft-com:office:word" xmlns:a="http://schemas.openxmlformats.org/drawingml/2006/main" xmlns:pic="http://schemas.openxmlformats.org/drawingml/2006/picture" xmlns:wp="http://schemas.openxmlformats.org/drawingml/2006/wordprocessingDrawing"/>
+<file path=word\fontTable.xml><?xml version="1.0" encoding="utf-8"?>
+<w:fonts xmlns:mc="http://schemas.openxmlformats.org/markup-compatibility/2006" xmlns:r="http://schemas.openxmlformats.org/officeDocument/2006/relationships" xmlns:w="http://schemas.openxmlformats.org/wordprocessingml/2006/main" xmlns:w14="http://schemas.microsoft.com/office/word/2010/wordml" xmlns:w15="http://schemas.microsoft.com/office/word/2012/wordml" xmlns:w16cex="http://schemas.microsoft.com/office/word/2018/wordml/cex" xmlns:w16cid="http://schemas.microsoft.com/office/word/2016/wordml/cid" xmlns:w16="http://schemas.microsoft.com/office/word/2018/wordml" xmlns:w16du="http://schemas.microsoft.com/office/word/2023/wordml/word16du" xmlns:w16sdtdh="http://schemas.microsoft.com/office/word/2020/wordml/sdtdatahash" xmlns:w16sdtfl="http://schemas.microsoft.com/office/word/2024/wordml/sdtformatlock" xmlns:w16se="http://schemas.microsoft.com/office/word/2015/wordml/symex" mc:Ignorable="w14 w15 w16se w16cid w16 w16cex w16sdtdh w16sdtfl w16du">
+  <w:font w:name="Times New Roman">
+    <w:panose1 w:val="02020603050405020304"/>
+    <w:charset w:val="00"/>
+    <w:family w:val="roman"/>
+    <w:pitch w:val="variable"/>
+    <w:sig w:usb0="E0002EFF" w:usb1="C000785B" w:usb2="00000009" w:usb3="00000000" w:csb0="000001FF" w:csb1="00000000"/>
+  </w:font>
+  <w:font w:name="PMingLiU">
+    <w:panose1 w:val="02010601000101010101"/>
+    <w:charset w:val="88"/>
+    <w:family w:val="roman"/>
+    <w:pitch w:val="variable"/>
+    <w:sig w:usb0="A00002FF" w:usb1="28CFFCFA" w:usb2="00000016" w:usb3="00000000" w:csb0="00100001" w:csb1="00000000"/>
+  </w:font>
+  <w:font w:name="宋体">
+    <w:altName w:val="SimSun"/>
+    <w:panose1 w:val="02010600030101010101"/>
+    <w:charset w:val="86"/>
+    <w:family w:val="auto"/>
+    <w:pitch w:val="variable"/>
+    <w:sig w:usb0="00000203" w:usb1="288F0000" w:usb2="00000016" w:usb3="00000000" w:csb0="00040001" w:csb1="00000000"/>
+  </w:font>
+  <w:font w:name="Symbol">
+    <w:panose1 w:val="05050102010706020507"/>
+    <w:charset w:val="02"/>
+    <w:family w:val="roman"/>
+    <w:pitch w:val="variable"/>
+    <w:sig w:usb0="00000000" w:usb1="10000000" w:usb2="00000000" w:usb3="00000000" w:csb0="80000000" w:csb1="00000000"/>
+  </w:font>
+  <w:font w:name="Times-Roman">
+    <w:altName w:val="Times New Roman"/>
+    <w:charset w:val="00"/>
+    <w:family w:val="roman"/>
+    <w:pitch w:val="default"/>
+    <w:sig w:usb0="00000003" w:usb1="00000000" w:usb2="00000000" w:usb3="00000000" w:csb0="00000001" w:csb1="00000000"/>
+  </w:font>
+  <w:font w:name="等线 Light">
+    <w:panose1 w:val="02010600030101010101"/>
+    <w:charset w:val="86"/>
+    <w:family w:val="auto"/>
+    <w:pitch w:val="variable"/>
+    <w:sig w:usb0="A00002BF" w:usb1="38CF7CFA" w:usb2="00000016" w:usb3="00000000" w:csb0="0004000F" w:csb1="00000000"/>
+  </w:font>
+  <w:font w:name="等线">
+    <w:altName w:val="DengXian"/>
+    <w:panose1 w:val="02010600030101010101"/>
+    <w:charset w:val="86"/>
+    <w:family w:val="auto"/>
+    <w:pitch w:val="variable"/>
+    <w:sig w:usb0="A00002BF" w:usb1="38CF7CFA" w:usb2="00000016" w:usb3="00000000" w:csb0="0004000F" w:csb1="00000000"/>
+  </w:font>
+</w:fonts>
 </file>
 
-<file path=word/footnotes.xml><?xml version="1.0" encoding="utf-8"?>
+<file path=word\footnotes.xml><?xml version="1.0" encoding="utf-8"?>
 <w:footnotes xmlns:w="http://schemas.openxmlformats.org/wordprocessingml/2006/main" xmlns:m="http://schemas.openxmlformats.org/officeDocument/2006/math" xmlns:r="http://schemas.openxmlformats.org/officeDocument/2006/relationships" xmlns:o="urn:schemas-microsoft-com:office:office" xmlns:v="urn:schemas-microsoft-com:vml" xmlns:w10="urn:schemas-microsoft-com:office:word" xmlns:a="http://schemas.openxmlformats.org/drawingml/2006/main" xmlns:pic="http://schemas.openxmlformats.org/drawingml/2006/picture" xmlns:wp="http://schemas.openxmlformats.org/drawingml/2006/wordprocessingDrawing">
   <w:footnote w:type="continuationSeparator" w:id="0">
     <w:p>
@@ -957,7 +1052,7 @@
 </w:footnotes>
 </file>
 
-<file path=word/header1.xml><?xml version="1.0" encoding="utf-8"?>
+<file path=word\header1.xml><?xml version="1.0" encoding="utf-8"?>
 <w:hdr xmlns:wpc="http://schemas.microsoft.com/office/word/2010/wordprocessingCanvas" xmlns:cx="http://schemas.microsoft.com/office/drawing/2014/chartex" xmlns:cx1="http://schemas.microsoft.com/office/drawing/2015/9/8/chartex" xmlns:cx2="http://schemas.microsoft.com/office/drawing/2015/10/21/chartex" xmlns:cx3="http://schemas.microsoft.com/office/drawing/2016/5/9/chartex" xmlns:cx4="http://schemas.microsoft.com/office/drawing/2016/5/10/chartex" xmlns:cx5="http://schemas.microsoft.com/office/drawing/2016/5/11/chartex" xmlns:cx6="http://schemas.microsoft.com/office/drawing/2016/5/12/chartex" xmlns:cx7="http://schemas.microsoft.com/office/drawing/2016/5/13/chartex" xmlns:cx8="http://schemas.microsoft.com/office/drawing/2016/5/14/chartex" xmlns:mc="http://schemas.openxmlformats.org/markup-compatibility/2006" xmlns:aink="http://schemas.microsoft.com/office/drawing/2016/ink" xmlns:am3d="http://schemas.microsoft.com/office/drawing/2017/model3d" xmlns:o="urn:schemas-microsoft-com:office:office" xmlns:oel="http://schemas.microsoft.com/office/2019/extlst" xmlns:r="http://schemas.openxmlformats.org/officeDocument/2006/relationships" xmlns:m="http://schemas.openxmlformats.org/officeDocument/2006/math" xmlns:v="urn:schemas-microsoft-com:vml" xmlns:wp14="http://schemas.microsoft.com/office/word/2010/wordprocessingDrawing" xmlns:wp="http://schemas.openxmlformats.org/drawingml/2006/wordprocessingDrawing" xmlns:w10="urn:schemas-microsoft-com:office:word" xmlns:w="http://schemas.openxmlformats.org/wordprocessingml/2006/main" xmlns:w14="http://schemas.microsoft.com/office/word/2010/wordml" xmlns:w15="http://schemas.microsoft.com/office/word/2012/wordml" xmlns:w16cex="http://schemas.microsoft.com/office/word/2018/wordml/cex" xmlns:w16cid="http://schemas.microsoft.com/office/word/2016/wordml/cid" xmlns:w16="http://schemas.microsoft.com/office/word/2018/wordml" xmlns:w16du="http://schemas.microsoft.com/office/word/2023/wordml/word16du" xmlns:w16sdtdh="http://schemas.microsoft.com/office/word/2020/wordml/sdtdatahash" xmlns:w16sdtfl="http://schemas.microsoft.com/office/word/2024/wordml/sdtformatlock" xmlns:w16se="http://schemas.microsoft.com/office/word/2015/wordml/symex" xmlns:wpg="http://schemas.microsoft.com/office/word/2010/wordprocessingGroup" xmlns:wpi="http://schemas.microsoft.com/office/word/2010/wordprocessingInk" xmlns:wne="http://schemas.microsoft.com/office/word/2006/wordml" xmlns:wps="http://schemas.microsoft.com/office/word/2010/wordprocessingShape" mc:Ignorable="w14 w15 w16se w16cid w16 w16cex w16sdtdh w16sdtfl w16du wp14">
   <w:p>
     <w:pPr>
@@ -975,7 +1070,7 @@
 </w:hdr>
 </file>
 
-<file path=word/numbering.xml><?xml version="1.0" encoding="utf-8"?>
+<file path=word\numbering.xml><?xml version="1.0" encoding="utf-8"?>
 <w:numbering xmlns:aink="http://schemas.microsoft.com/office/drawing/2016/ink" xmlns:am3d="http://schemas.microsoft.com/office/drawing/2017/model3d" xmlns:cx="http://schemas.microsoft.com/office/drawing/2014/chartex" xmlns:cx1="http://schemas.microsoft.com/office/drawing/2015/9/8/chartex" xmlns:cx2="http://schemas.microsoft.com/office/drawing/2015/10/21/chartex" xmlns:cx3="http://schemas.microsoft.com/office/drawing/2016/5/9/chartex" xmlns:cx4="http://schemas.microsoft.com/office/drawing/2016/5/10/chartex" xmlns:cx5="http://schemas.microsoft.com/office/drawing/2016/5/11/chartex" xmlns:cx6="http://schemas.microsoft.com/office/drawing/2016/5/12/chartex" xmlns:cx7="http://schemas.microsoft.com/office/drawing/2016/5/13/chartex" xmlns:cx8="http://schemas.microsoft.com/office/drawing/2016/5/14/chartex" xmlns:m="http://schemas.openxmlformats.org/officeDocument/2006/math" xmlns:mc="http://schemas.openxmlformats.org/markup-compatibility/2006" xmlns:o="urn:schemas-microsoft-com:office:office" xmlns:oel="http://schemas.microsoft.com/office/2019/extlst" xmlns:r="http://schemas.openxmlformats.org/officeDocument/2006/relationships" xmlns:v="urn:schemas-microsoft-com:vml" xmlns:w="http://schemas.openxmlformats.org/wordprocessingml/2006/main" xmlns:w10="urn:schemas-microsoft-com:office:word" xmlns:w14="http://schemas.microsoft.com/office/word/2010/wordml" xmlns:w15="http://schemas.microsoft.com/office/word/2012/wordml" xmlns:w16="http://schemas.microsoft.com/office/word/2018/wordml" xmlns:w16cex="http://schemas.microsoft.com/office/word/2018/wordml/cex" xmlns:w16cid="http://schemas.microsoft.com/office/word/2016/wordml/cid" xmlns:w16du="http://schemas.microsoft.com/office/word/2023/wordml/word16du" xmlns:w16sdtdh="http://schemas.microsoft.com/office/word/2020/wordml/sdtdatahash" xmlns:w16sdtfl="http://schemas.microsoft.com/office/word/2024/wordml/sdtformatlock" xmlns:w16se="http://schemas.microsoft.com/office/word/2015/wordml/symex" xmlns:wne="http://schemas.microsoft.com/office/word/2006/wordml" xmlns:wp="http://schemas.openxmlformats.org/drawingml/2006/wordprocessingDrawing" xmlns:wp14="http://schemas.microsoft.com/office/word/2010/wordprocessingDrawing" xmlns:wpc="http://schemas.microsoft.com/office/word/2010/wordprocessingCanvas" xmlns:wpg="http://schemas.microsoft.com/office/word/2010/wordprocessingGroup" xmlns:wpi="http://schemas.microsoft.com/office/word/2010/wordprocessingInk" xmlns:wps="http://schemas.microsoft.com/office/word/2010/wordprocessingShape" mc:Ignorable="w14 w15 w16se w16cid w16 w16cex w16sdtdh w16sdtfl w16du wp14">
   <w:abstractNum w15:restartNumberingAfterBreak="0" w:abstractNumId="0">
     <w:nsid w:val="FFFFFFFB"/>
@@ -1187,7 +1282,298 @@
 </w:numbering>
 </file>
 
-<file path=word/styles.xml><?xml version="1.0" encoding="utf-8"?>
+<file path=word\settings.xml><?xml version="1.0" encoding="utf-8"?>
+<w:settings xmlns:m="http://schemas.openxmlformats.org/officeDocument/2006/math" xmlns:o="urn:schemas-microsoft-com:office:office" xmlns:r="http://schemas.openxmlformats.org/officeDocument/2006/relationships" xmlns:sl="http://schemas.openxmlformats.org/schemaLibrary/2006/main" xmlns:v="urn:schemas-microsoft-com:vml" xmlns:w="http://schemas.openxmlformats.org/wordprocessingml/2006/main" xmlns:w10="urn:schemas-microsoft-com:office:word">
+  <w:zoom w:percent="100"/>
+  <w:embedSystemFonts/>
+  <w:proofState w:grammar="clean"/>
+  <w:stylePaneFormatFilter w:allStyles="1" w:alternateStyleNames="0" w:clearFormatting="1" w:customStyles="0" w:directFormattingOnNumbering="1" w:directFormattingOnParagraphs="1" w:directFormattingOnRuns="1" w:directFormattingOnTables="1" w:headingStyles="0" w:latentStyles="0" w:numberingStyles="0" w:stylesInUse="0" w:tableStyles="0" w:top3HeadingStyles="1" w:val="3F01" w:visibleStyles="0"/>
+  <w:doNotTrackMoves/>
+  <w:defaultTabStop w:val="202"/>
+  <w:doNotHyphenateCaps/>
+  <w:drawingGridHorizontalSpacing w:val="120"/>
+  <w:drawingGridVerticalSpacing w:val="120"/>
+  <w:displayHorizontalDrawingGridEvery w:val="0"/>
+  <w:displayVerticalDrawingGridEvery w:val="3"/>
+  <w:doNotUseMarginsForDrawingGridOrigin/>
+  <w:characterSpacingControl w:val="compressPunctuation"/>
+  <w:savePreviewPicture/>
+  <w:hdrShapeDefaults>
+    <o:shapedefaults spidmax="2057" v:ext="edit"/>
+  </w:hdrShapeDefaults>
+  <w:compat>
+    <w:lineWrapLikeWord6/>
+    <w:printColBlack/>
+    <w:usePrinterMetrics/>
+    <w:footnoteLayoutLikeWW8/>
+    <w:shapeLayoutLikeWW8/>
+    <w:alignTablesRowByRow/>
+    <w:forgetLastTabAlignment/>
+    <w:noSpaceRaiseLower/>
+    <w:doNotUseHTMLParagraphAutoSpacing/>
+    <w:layoutRawTableWidth/>
+    <w:layoutTableRowsApart/>
+    <w:useWord97LineBreakRules/>
+    <w:doNotBreakWrappedTables/>
+    <w:doNotSnapToGridInCell/>
+    <w:selectFldWithFirstOrLastChar/>
+    <w:doNotWrapTextWithPunct/>
+    <w:doNotUseEastAsianBreakRules/>
+    <w:useWord2002TableStyleRules/>
+    <w:growAutofit/>
+    <w:useFELayout/>
+    <w:useNormalStyleForList/>
+    <w:doNotUseIndentAsNumberingTabStop/>
+    <w:useAltKinsokuLineBreakRules/>
+    <w:allowSpaceOfSameStyleInTable/>
+    <w:doNotSuppressIndentation/>
+    <w:doNotAutofitConstrainedTables/>
+    <w:autofitToFirstFixedWidthCell/>
+    <w:displayHangulFixedWidth/>
+    <w:splitPgBreakAndParaMark/>
+    <w:doNotVertAlignCellWithSp/>
+    <w:doNotBreakConstrainedForcedTable/>
+    <w:doNotVertAlignInTxbx/>
+    <w:useAnsiKerningPairs/>
+    <w:cachedColBalance/>
+    <w:compatSetting w:name="compatibilityMode" w:uri="http://schemas.microsoft.com/office/word" w:val="11"/>
+    <w:compatSetting w:name="allowHyphenationAtTrackBottom" w:uri="http://schemas.microsoft.com/office/word" w:val="1"/>
+    <w:compatSetting w:name="useWord2013TrackBottomHyphenation" w:uri="http://schemas.microsoft.com/office/word" w:val="1"/>
+  </w:compat>
+  <w:rsids>
+    <w:rsidRoot w:val="00EB092C"/>
+    <w:rsid w:val="00006E2D"/>
+    <w:rsid w:val="00010A35"/>
+    <w:rsid w:val="00020A6B"/>
+    <w:rsid w:val="00022AD7"/>
+    <w:rsid w:val="00023D9D"/>
+    <w:rsid w:val="000308F0"/>
+    <w:rsid w:val="00031F45"/>
+    <w:rsid w:val="0003482B"/>
+    <w:rsid w:val="00053099"/>
+    <w:rsid w:val="00065FA3"/>
+    <w:rsid w:val="00070579"/>
+    <w:rsid w:val="00073A7B"/>
+    <w:rsid w:val="00093946"/>
+    <w:rsid w:val="000A3E12"/>
+    <w:rsid w:val="000A549A"/>
+    <w:rsid w:val="000C1765"/>
+    <w:rsid w:val="000D2B00"/>
+    <w:rsid w:val="000E1DFC"/>
+    <w:rsid w:val="001179E0"/>
+    <w:rsid w:val="00121A46"/>
+    <w:rsid w:val="00131CDC"/>
+    <w:rsid w:val="001913C4"/>
+    <w:rsid w:val="00197551"/>
+    <w:rsid w:val="001A0C37"/>
+    <w:rsid w:val="001C5E06"/>
+    <w:rsid w:val="001D3F54"/>
+    <w:rsid w:val="001D59D3"/>
+    <w:rsid w:val="001F746D"/>
+    <w:rsid w:val="00216660"/>
+    <w:rsid w:val="002255DB"/>
+    <w:rsid w:val="00227166"/>
+    <w:rsid w:val="00230B31"/>
+    <w:rsid w:val="00241BD8"/>
+    <w:rsid w:val="00243A96"/>
+    <w:rsid w:val="00256C95"/>
+    <w:rsid w:val="00272F1A"/>
+    <w:rsid w:val="002A0D03"/>
+    <w:rsid w:val="002C2613"/>
+    <w:rsid w:val="002D2DE0"/>
+    <w:rsid w:val="002D3073"/>
+    <w:rsid w:val="002E2C98"/>
+    <w:rsid w:val="002F7706"/>
+    <w:rsid w:val="00302A1D"/>
+    <w:rsid w:val="00302A86"/>
+    <w:rsid w:val="00306191"/>
+    <w:rsid w:val="003443AB"/>
+    <w:rsid w:val="003544EE"/>
+    <w:rsid w:val="00375A49"/>
+    <w:rsid w:val="00390DB2"/>
+    <w:rsid w:val="00395C28"/>
+    <w:rsid w:val="003A2CDE"/>
+    <w:rsid w:val="003A40B2"/>
+    <w:rsid w:val="003A59F2"/>
+    <w:rsid w:val="003B3425"/>
+    <w:rsid w:val="003C1795"/>
+    <w:rsid w:val="003F1116"/>
+    <w:rsid w:val="003F4CE4"/>
+    <w:rsid w:val="003F54EF"/>
+    <w:rsid w:val="00403BDA"/>
+    <w:rsid w:val="004117EE"/>
+    <w:rsid w:val="004125D8"/>
+    <w:rsid w:val="004246EA"/>
+    <w:rsid w:val="00424F3C"/>
+    <w:rsid w:val="00450809"/>
+    <w:rsid w:val="004626D3"/>
+    <w:rsid w:val="0046698A"/>
+    <w:rsid w:val="004B26AC"/>
+    <w:rsid w:val="004D3136"/>
+    <w:rsid w:val="004E3A86"/>
+    <w:rsid w:val="00502298"/>
+    <w:rsid w:val="0050306C"/>
+    <w:rsid w:val="00504CB6"/>
+    <w:rsid w:val="00513ED0"/>
+    <w:rsid w:val="005364F9"/>
+    <w:rsid w:val="00550132"/>
+    <w:rsid w:val="00556AF4"/>
+    <w:rsid w:val="005707AE"/>
+    <w:rsid w:val="00594D5D"/>
+    <w:rsid w:val="005A4749"/>
+    <w:rsid w:val="005D39C9"/>
+    <w:rsid w:val="005D5B15"/>
+    <w:rsid w:val="005F2365"/>
+    <w:rsid w:val="005F2982"/>
+    <w:rsid w:val="005F42CC"/>
+    <w:rsid w:val="005F7847"/>
+    <w:rsid w:val="006054B2"/>
+    <w:rsid w:val="0064626B"/>
+    <w:rsid w:val="00650FDB"/>
+    <w:rsid w:val="0065530C"/>
+    <w:rsid w:val="0066205B"/>
+    <w:rsid w:val="0066365D"/>
+    <w:rsid w:val="006660F2"/>
+    <w:rsid w:val="00671855"/>
+    <w:rsid w:val="006819F8"/>
+    <w:rsid w:val="006C6291"/>
+    <w:rsid w:val="006E6884"/>
+    <w:rsid w:val="006F6D45"/>
+    <w:rsid w:val="006F73DE"/>
+    <w:rsid w:val="00706921"/>
+    <w:rsid w:val="00725621"/>
+    <w:rsid w:val="0072580B"/>
+    <w:rsid w:val="00727ADC"/>
+    <w:rsid w:val="007317C4"/>
+    <w:rsid w:val="00753DD9"/>
+    <w:rsid w:val="00754604"/>
+    <w:rsid w:val="0076266A"/>
+    <w:rsid w:val="00777FCD"/>
+    <w:rsid w:val="00780192"/>
+    <w:rsid w:val="00782D82"/>
+    <w:rsid w:val="007A42CC"/>
+    <w:rsid w:val="007B302F"/>
+    <w:rsid w:val="007B5C10"/>
+    <w:rsid w:val="007C5EB3"/>
+    <w:rsid w:val="007C7471"/>
+    <w:rsid w:val="008017FE"/>
+    <w:rsid w:val="00802E88"/>
+    <w:rsid w:val="008074FC"/>
+    <w:rsid w:val="00826802"/>
+    <w:rsid w:val="00840C06"/>
+    <w:rsid w:val="00872EF0"/>
+    <w:rsid w:val="0088363A"/>
+    <w:rsid w:val="008A2FCC"/>
+    <w:rsid w:val="008A30CF"/>
+    <w:rsid w:val="00906944"/>
+    <w:rsid w:val="00916919"/>
+    <w:rsid w:val="00926D7E"/>
+    <w:rsid w:val="009526A0"/>
+    <w:rsid w:val="0097355C"/>
+    <w:rsid w:val="009763C9"/>
+    <w:rsid w:val="00977AEE"/>
+    <w:rsid w:val="0098708C"/>
+    <w:rsid w:val="009973C3"/>
+    <w:rsid w:val="009B3257"/>
+    <w:rsid w:val="009C0FB1"/>
+    <w:rsid w:val="009E5DA5"/>
+    <w:rsid w:val="00A21EF0"/>
+    <w:rsid w:val="00A36124"/>
+    <w:rsid w:val="00A40D30"/>
+    <w:rsid w:val="00A513CD"/>
+    <w:rsid w:val="00A54C82"/>
+    <w:rsid w:val="00A81199"/>
+    <w:rsid w:val="00A9415F"/>
+    <w:rsid w:val="00AB5BA8"/>
+    <w:rsid w:val="00AC667A"/>
+    <w:rsid w:val="00AD56CE"/>
+    <w:rsid w:val="00AE4BDC"/>
+    <w:rsid w:val="00B15D5A"/>
+    <w:rsid w:val="00B335EB"/>
+    <w:rsid w:val="00B40595"/>
+    <w:rsid w:val="00B42D7A"/>
+    <w:rsid w:val="00B42E5A"/>
+    <w:rsid w:val="00B56A52"/>
+    <w:rsid w:val="00B6458A"/>
+    <w:rsid w:val="00B73113"/>
+    <w:rsid w:val="00B777AC"/>
+    <w:rsid w:val="00B84C0F"/>
+    <w:rsid w:val="00BB639A"/>
+    <w:rsid w:val="00BC5F62"/>
+    <w:rsid w:val="00BD70FA"/>
+    <w:rsid w:val="00BD7794"/>
+    <w:rsid w:val="00C03DC8"/>
+    <w:rsid w:val="00C46B63"/>
+    <w:rsid w:val="00C5094C"/>
+    <w:rsid w:val="00C6171A"/>
+    <w:rsid w:val="00C704EC"/>
+    <w:rsid w:val="00C70B81"/>
+    <w:rsid w:val="00C82E7E"/>
+    <w:rsid w:val="00C9698F"/>
+    <w:rsid w:val="00CA2017"/>
+    <w:rsid w:val="00CE3A1C"/>
+    <w:rsid w:val="00CE6934"/>
+    <w:rsid w:val="00CF2712"/>
+    <w:rsid w:val="00D15514"/>
+    <w:rsid w:val="00D37D1E"/>
+    <w:rsid w:val="00D4349D"/>
+    <w:rsid w:val="00D53FEC"/>
+    <w:rsid w:val="00D9137F"/>
+    <w:rsid w:val="00DA2AD6"/>
+    <w:rsid w:val="00DD0E15"/>
+    <w:rsid w:val="00DF2105"/>
+    <w:rsid w:val="00DF307B"/>
+    <w:rsid w:val="00DF7CE7"/>
+    <w:rsid w:val="00E04360"/>
+    <w:rsid w:val="00E61C1D"/>
+    <w:rsid w:val="00E62F41"/>
+    <w:rsid w:val="00EA21EA"/>
+    <w:rsid w:val="00EA4A43"/>
+    <w:rsid w:val="00EA7827"/>
+    <w:rsid w:val="00EB0151"/>
+    <w:rsid w:val="00EB092C"/>
+    <w:rsid w:val="00EB5DE1"/>
+    <w:rsid w:val="00EF5DAF"/>
+    <w:rsid w:val="00EF6F47"/>
+    <w:rsid w:val="00F0454D"/>
+    <w:rsid w:val="00F22915"/>
+    <w:rsid w:val="00F250B0"/>
+    <w:rsid w:val="00F25F7E"/>
+    <w:rsid w:val="00F34ED3"/>
+    <w:rsid w:val="00F363EB"/>
+    <w:rsid w:val="00F41BC9"/>
+    <w:rsid w:val="00F47334"/>
+    <w:rsid w:val="00F63764"/>
+    <w:rsid w:val="00F67F28"/>
+    <w:rsid w:val="00F7052E"/>
+    <w:rsid w:val="00F768CA"/>
+    <w:rsid w:val="00F8245D"/>
+    <w:rsid w:val="00F83769"/>
+    <w:rsid w:val="00FA087C"/>
+    <w:rsid w:val="00FA2D5F"/>
+    <w:rsid w:val="00FA5EE2"/>
+    <w:rsid w:val="00FB1DB2"/>
+    <w:rsid w:val="00FB5543"/>
+    <w:rsid w:val="00FC2790"/>
+    <w:rsid w:val="00FD2DA0"/>
+    <w:rsid w:val="00FE5C6C"/>
+    <w:rsid w:val="28076211"/>
+  </w:rsids>
+  <w:themeFontLang w:eastAsia="zh-CN" w:val="en-US"/>
+  <w:clrSchemeMapping w:accent1="accent1" w:accent2="accent2" w:accent3="accent3" w:accent4="accent4" w:accent5="accent5" w:accent6="accent6" w:bg1="light1" w:bg2="light2" w:followedHyperlink="followedHyperlink" w:hyperlink="hyperlink" w:t1="dark1" w:t2="dark2"/>
+  <w:doNotIncludeSubdocsInStats/>
+  <w:shapeDefaults>
+    <o:shapedefaults spidmax="2057" v:ext="edit"/>
+    <o:shapelayout v:ext="edit">
+      <o:idmap data="2" v:ext="edit"/>
+    </o:shapelayout>
+  </w:shapeDefaults>
+  <w:decimalSymbol w:val="."/>
+  <w:listSeparator w:val=","/>
+</w:settings>
+</file>
+
+<file path=word\styles.xml><?xml version="1.0" encoding="utf-8"?>
 <w:styles xmlns:mc="http://schemas.openxmlformats.org/markup-compatibility/2006" xmlns:r="http://schemas.openxmlformats.org/officeDocument/2006/relationships" xmlns:w="http://schemas.openxmlformats.org/wordprocessingml/2006/main" xmlns:w14="http://schemas.microsoft.com/office/word/2010/wordml" xmlns:w15="http://schemas.microsoft.com/office/word/2012/wordml" xmlns:w16="http://schemas.microsoft.com/office/word/2018/wordml" xmlns:w16cex="http://schemas.microsoft.com/office/word/2018/wordml/cex" xmlns:w16cid="http://schemas.microsoft.com/office/word/2016/wordml/cid" xmlns:w16du="http://schemas.microsoft.com/office/word/2023/wordml/word16du" xmlns:w16sdtdh="http://schemas.microsoft.com/office/word/2020/wordml/sdtdatahash" xmlns:w16sdtfl="http://schemas.microsoft.com/office/word/2024/wordml/sdtformatlock" xmlns:w16se="http://schemas.microsoft.com/office/word/2015/wordml/symex" mc:Ignorable="w14 w15 w16se w16cid w16 w16cex w16sdtdh w16sdtfl w16du">
   <w:docDefaults>
     <w:rPrDefault>
@@ -1986,7 +2372,7 @@
       <w:szCs w:val="20"/>
     </w:rPr>
   </w:style>
-  <w:style w:type="character" w:customStyle="1" w:styleId="KeywordTok">
+  <w:style w:customStyle="1" w:styleId="KeywordTok" w:type="character">
     <w:name w:val="KeywordTok"/>
     <w:basedOn w:val="VerbatimChar"/>
     <w:rPr>
@@ -1994,77 +2380,77 @@
       <w:color w:val="007020"/>
     </w:rPr>
   </w:style>
-  <w:style w:type="character" w:customStyle="1" w:styleId="DataTypeTok">
+  <w:style w:customStyle="1" w:styleId="DataTypeTok" w:type="character">
     <w:name w:val="DataTypeTok"/>
     <w:basedOn w:val="VerbatimChar"/>
     <w:rPr>
       <w:color w:val="902000"/>
     </w:rPr>
   </w:style>
-  <w:style w:type="character" w:customStyle="1" w:styleId="DecValTok">
+  <w:style w:customStyle="1" w:styleId="DecValTok" w:type="character">
     <w:name w:val="DecValTok"/>
     <w:basedOn w:val="VerbatimChar"/>
     <w:rPr>
       <w:color w:val="40a070"/>
     </w:rPr>
   </w:style>
-  <w:style w:type="character" w:customStyle="1" w:styleId="BaseNTok">
+  <w:style w:customStyle="1" w:styleId="BaseNTok" w:type="character">
     <w:name w:val="BaseNTok"/>
     <w:basedOn w:val="VerbatimChar"/>
     <w:rPr>
       <w:color w:val="40a070"/>
     </w:rPr>
   </w:style>
-  <w:style w:type="character" w:customStyle="1" w:styleId="FloatTok">
+  <w:style w:customStyle="1" w:styleId="FloatTok" w:type="character">
     <w:name w:val="FloatTok"/>
     <w:basedOn w:val="VerbatimChar"/>
     <w:rPr>
       <w:color w:val="40a070"/>
     </w:rPr>
   </w:style>
-  <w:style w:type="character" w:customStyle="1" w:styleId="ConstantTok">
+  <w:style w:customStyle="1" w:styleId="ConstantTok" w:type="character">
     <w:name w:val="ConstantTok"/>
     <w:basedOn w:val="VerbatimChar"/>
     <w:rPr>
       <w:color w:val="880000"/>
     </w:rPr>
   </w:style>
-  <w:style w:type="character" w:customStyle="1" w:styleId="CharTok">
+  <w:style w:customStyle="1" w:styleId="CharTok" w:type="character">
     <w:name w:val="CharTok"/>
     <w:basedOn w:val="VerbatimChar"/>
     <w:rPr>
       <w:color w:val="4070a0"/>
     </w:rPr>
   </w:style>
-  <w:style w:type="character" w:customStyle="1" w:styleId="SpecialCharTok">
+  <w:style w:customStyle="1" w:styleId="SpecialCharTok" w:type="character">
     <w:name w:val="SpecialCharTok"/>
     <w:basedOn w:val="VerbatimChar"/>
     <w:rPr>
       <w:color w:val="4070a0"/>
     </w:rPr>
   </w:style>
-  <w:style w:type="character" w:customStyle="1" w:styleId="StringTok">
+  <w:style w:customStyle="1" w:styleId="StringTok" w:type="character">
     <w:name w:val="StringTok"/>
     <w:basedOn w:val="VerbatimChar"/>
     <w:rPr>
       <w:color w:val="4070a0"/>
     </w:rPr>
   </w:style>
-  <w:style w:type="character" w:customStyle="1" w:styleId="VerbatimStringTok">
+  <w:style w:customStyle="1" w:styleId="VerbatimStringTok" w:type="character">
     <w:name w:val="VerbatimStringTok"/>
     <w:basedOn w:val="VerbatimChar"/>
     <w:rPr>
       <w:color w:val="4070a0"/>
     </w:rPr>
   </w:style>
-  <w:style w:type="character" w:customStyle="1" w:styleId="SpecialStringTok">
+  <w:style w:customStyle="1" w:styleId="SpecialStringTok" w:type="character">
     <w:name w:val="SpecialStringTok"/>
     <w:basedOn w:val="VerbatimChar"/>
     <w:rPr>
       <w:color w:val="bb6688"/>
     </w:rPr>
   </w:style>
-  <w:style w:type="character" w:customStyle="1" w:styleId="ImportTok">
+  <w:style w:customStyle="1" w:styleId="ImportTok" w:type="character">
     <w:name w:val="ImportTok"/>
     <w:basedOn w:val="VerbatimChar"/>
     <w:rPr>
@@ -2072,7 +2458,7 @@
       <w:color w:val="008000"/>
     </w:rPr>
   </w:style>
-  <w:style w:type="character" w:customStyle="1" w:styleId="CommentTok">
+  <w:style w:customStyle="1" w:styleId="CommentTok" w:type="character">
     <w:name w:val="CommentTok"/>
     <w:basedOn w:val="VerbatimChar"/>
     <w:rPr>
@@ -2080,7 +2466,7 @@
       <w:color w:val="60a0b0"/>
     </w:rPr>
   </w:style>
-  <w:style w:type="character" w:customStyle="1" w:styleId="DocumentationTok">
+  <w:style w:customStyle="1" w:styleId="DocumentationTok" w:type="character">
     <w:name w:val="DocumentationTok"/>
     <w:basedOn w:val="VerbatimChar"/>
     <w:rPr>
@@ -2088,7 +2474,7 @@
       <w:color w:val="ba2121"/>
     </w:rPr>
   </w:style>
-  <w:style w:type="character" w:customStyle="1" w:styleId="AnnotationTok">
+  <w:style w:customStyle="1" w:styleId="AnnotationTok" w:type="character">
     <w:name w:val="AnnotationTok"/>
     <w:basedOn w:val="VerbatimChar"/>
     <w:rPr>
@@ -2097,7 +2483,7 @@
       <w:color w:val="60a0b0"/>
     </w:rPr>
   </w:style>
-  <w:style w:type="character" w:customStyle="1" w:styleId="CommentVarTok">
+  <w:style w:customStyle="1" w:styleId="CommentVarTok" w:type="character">
     <w:name w:val="CommentVarTok"/>
     <w:basedOn w:val="VerbatimChar"/>
     <w:rPr>
@@ -2106,28 +2492,28 @@
       <w:color w:val="60a0b0"/>
     </w:rPr>
   </w:style>
-  <w:style w:type="character" w:customStyle="1" w:styleId="OtherTok">
+  <w:style w:customStyle="1" w:styleId="OtherTok" w:type="character">
     <w:name w:val="OtherTok"/>
     <w:basedOn w:val="VerbatimChar"/>
     <w:rPr>
       <w:color w:val="007020"/>
     </w:rPr>
   </w:style>
-  <w:style w:type="character" w:customStyle="1" w:styleId="FunctionTok">
+  <w:style w:customStyle="1" w:styleId="FunctionTok" w:type="character">
     <w:name w:val="FunctionTok"/>
     <w:basedOn w:val="VerbatimChar"/>
     <w:rPr>
       <w:color w:val="06287e"/>
     </w:rPr>
   </w:style>
-  <w:style w:type="character" w:customStyle="1" w:styleId="VariableTok">
+  <w:style w:customStyle="1" w:styleId="VariableTok" w:type="character">
     <w:name w:val="VariableTok"/>
     <w:basedOn w:val="VerbatimChar"/>
     <w:rPr>
       <w:color w:val="19177c"/>
     </w:rPr>
   </w:style>
-  <w:style w:type="character" w:customStyle="1" w:styleId="ControlFlowTok">
+  <w:style w:customStyle="1" w:styleId="ControlFlowTok" w:type="character">
     <w:name w:val="ControlFlowTok"/>
     <w:basedOn w:val="VerbatimChar"/>
     <w:rPr>
@@ -2135,45 +2521,45 @@
       <w:color w:val="007020"/>
     </w:rPr>
   </w:style>
-  <w:style w:type="character" w:customStyle="1" w:styleId="OperatorTok">
+  <w:style w:customStyle="1" w:styleId="OperatorTok" w:type="character">
     <w:name w:val="OperatorTok"/>
     <w:basedOn w:val="VerbatimChar"/>
     <w:rPr>
       <w:color w:val="666666"/>
     </w:rPr>
   </w:style>
-  <w:style w:type="character" w:customStyle="1" w:styleId="BuiltInTok">
+  <w:style w:customStyle="1" w:styleId="BuiltInTok" w:type="character">
     <w:name w:val="BuiltInTok"/>
     <w:basedOn w:val="VerbatimChar"/>
     <w:rPr>
       <w:color w:val="008000"/>
     </w:rPr>
   </w:style>
-  <w:style w:type="character" w:customStyle="1" w:styleId="ExtensionTok">
+  <w:style w:customStyle="1" w:styleId="ExtensionTok" w:type="character">
     <w:name w:val="ExtensionTok"/>
     <w:basedOn w:val="VerbatimChar"/>
     <w:rPr/>
   </w:style>
-  <w:style w:type="character" w:customStyle="1" w:styleId="PreprocessorTok">
+  <w:style w:customStyle="1" w:styleId="PreprocessorTok" w:type="character">
     <w:name w:val="PreprocessorTok"/>
     <w:basedOn w:val="VerbatimChar"/>
     <w:rPr>
       <w:color w:val="bc7a00"/>
     </w:rPr>
   </w:style>
-  <w:style w:type="character" w:customStyle="1" w:styleId="AttributeTok">
+  <w:style w:customStyle="1" w:styleId="AttributeTok" w:type="character">
     <w:name w:val="AttributeTok"/>
     <w:basedOn w:val="VerbatimChar"/>
     <w:rPr>
       <w:color w:val="7d9029"/>
     </w:rPr>
   </w:style>
-  <w:style w:type="character" w:customStyle="1" w:styleId="RegionMarkerTok">
+  <w:style w:customStyle="1" w:styleId="RegionMarkerTok" w:type="character">
     <w:name w:val="RegionMarkerTok"/>
     <w:basedOn w:val="VerbatimChar"/>
     <w:rPr/>
   </w:style>
-  <w:style w:type="character" w:customStyle="1" w:styleId="InformationTok">
+  <w:style w:customStyle="1" w:styleId="InformationTok" w:type="character">
     <w:name w:val="InformationTok"/>
     <w:basedOn w:val="VerbatimChar"/>
     <w:rPr>
@@ -2182,7 +2568,7 @@
       <w:color w:val="60a0b0"/>
     </w:rPr>
   </w:style>
-  <w:style w:type="character" w:customStyle="1" w:styleId="WarningTok">
+  <w:style w:customStyle="1" w:styleId="WarningTok" w:type="character">
     <w:name w:val="WarningTok"/>
     <w:basedOn w:val="VerbatimChar"/>
     <w:rPr>
@@ -2191,7 +2577,7 @@
       <w:color w:val="60a0b0"/>
     </w:rPr>
   </w:style>
-  <w:style w:type="character" w:customStyle="1" w:styleId="AlertTok">
+  <w:style w:customStyle="1" w:styleId="AlertTok" w:type="character">
     <w:name w:val="AlertTok"/>
     <w:basedOn w:val="VerbatimChar"/>
     <w:rPr>
@@ -2199,7 +2585,7 @@
       <w:color w:val="ff0000"/>
     </w:rPr>
   </w:style>
-  <w:style w:type="character" w:customStyle="1" w:styleId="ErrorTok">
+  <w:style w:customStyle="1" w:styleId="ErrorTok" w:type="character">
     <w:name w:val="ErrorTok"/>
     <w:basedOn w:val="VerbatimChar"/>
     <w:rPr>
@@ -2207,7 +2593,7 @@
       <w:color w:val="ff0000"/>
     </w:rPr>
   </w:style>
-  <w:style w:type="character" w:customStyle="1" w:styleId="NormalTok">
+  <w:style w:customStyle="1" w:styleId="NormalTok" w:type="character">
     <w:name w:val="NormalTok"/>
     <w:basedOn w:val="VerbatimChar"/>
     <w:rPr/>
@@ -2215,7 +2601,7 @@
 </w:styles>
 </file>
 
-<file path=word/theme/theme1.xml><?xml version="1.0" encoding="utf-8"?>
+<file path=word\theme\theme1.xml><?xml version="1.0" encoding="utf-8"?>
 <a:theme xmlns:a="http://schemas.openxmlformats.org/drawingml/2006/main" name="Office 主题​​">
   <a:themeElements>
     <a:clrScheme name="Office">
@@ -2508,4 +2894,12 @@
     </a:ext>
   </a:extLst>
 </a:theme>
+</file>
+
+<file path=word\webSettings.xml><?xml version="1.0" encoding="utf-8"?>
+<w:webSettings xmlns:mc="http://schemas.openxmlformats.org/markup-compatibility/2006" xmlns:r="http://schemas.openxmlformats.org/officeDocument/2006/relationships" xmlns:w="http://schemas.openxmlformats.org/wordprocessingml/2006/main" xmlns:w14="http://schemas.microsoft.com/office/word/2010/wordml" xmlns:w15="http://schemas.microsoft.com/office/word/2012/wordml" xmlns:w16cex="http://schemas.microsoft.com/office/word/2018/wordml/cex" xmlns:w16cid="http://schemas.microsoft.com/office/word/2016/wordml/cid" xmlns:w16="http://schemas.microsoft.com/office/word/2018/wordml" xmlns:w16du="http://schemas.microsoft.com/office/word/2023/wordml/word16du" xmlns:w16sdtdh="http://schemas.microsoft.com/office/word/2020/wordml/sdtdatahash" xmlns:w16sdtfl="http://schemas.microsoft.com/office/word/2024/wordml/sdtformatlock" xmlns:w16se="http://schemas.microsoft.com/office/word/2015/wordml/symex" mc:Ignorable="w14 w15 w16se w16cid w16 w16cex w16sdtdh w16sdtfl w16du">
+  <w:encoding w:val="x-cp20936"/>
+  <w:optimizeForBrowser/>
+  <w:allowPNG/>
+</w:webSettings>
 </file>
</xml_diff>